<commit_message>
Docs: hướng dẫn Cơ sở bổ sung Chọn nguyên liệu/Chọn kho
Co-Authored-By: Claude Opus 5.5 <noreply@anthropic.com>
</commit_message>
<xml_diff>
--- a/Docs/Huong-dan-su-dung-Co-so.docx
+++ b/Docs/Huong-dan-su-dung-Co-so.docx
@@ -1,6 +1,6 @@
 
 <file path=word/document.xml><?xml version="1.0" encoding="utf-8"?>
-<w:document xmlns:w="http://schemas.openxmlformats.org/wordprocessingml/2006/main" xmlns:r="http://schemas.openxmlformats.org/officeDocument/2006/relationships" xmlns:wp="http://schemas.openxmlformats.org/drawingml/2006/wordprocessingDrawing" xmlns:a="http://schemas.openxmlformats.org/drawingml/2006/main" xmlns:pic="http://schemas.openxmlformats.org/drawingml/2006/picture">
+<w:document xmlns:wpc="http://schemas.microsoft.com/office/word/2010/wordprocessingCanvas" xmlns:cx="http://schemas.microsoft.com/office/drawing/2014/chartex" xmlns:cx1="http://schemas.microsoft.com/office/drawing/2015/9/8/chartex" xmlns:cx2="http://schemas.microsoft.com/office/drawing/2015/10/21/chartex" xmlns:cx3="http://schemas.microsoft.com/office/drawing/2016/5/9/chartex" xmlns:cx4="http://schemas.microsoft.com/office/drawing/2016/5/10/chartex" xmlns:cx5="http://schemas.microsoft.com/office/drawing/2016/5/11/chartex" xmlns:cx6="http://schemas.microsoft.com/office/drawing/2016/5/12/chartex" xmlns:cx7="http://schemas.microsoft.com/office/drawing/2016/5/13/chartex" xmlns:cx8="http://schemas.microsoft.com/office/drawing/2016/5/14/chartex" xmlns:mc="http://schemas.openxmlformats.org/markup-compatibility/2006" xmlns:aink="http://schemas.microsoft.com/office/drawing/2016/ink" xmlns:am3d="http://schemas.microsoft.com/office/drawing/2017/model3d" xmlns:o="urn:schemas-microsoft-com:office:office" xmlns:oel="http://schemas.microsoft.com/office/2019/extlst" xmlns:r="http://schemas.openxmlformats.org/officeDocument/2006/relationships" xmlns:m="http://schemas.openxmlformats.org/officeDocument/2006/math" xmlns:v="urn:schemas-microsoft-com:vml" xmlns:wp14="http://schemas.microsoft.com/office/word/2010/wordprocessingDrawing" xmlns:wp="http://schemas.openxmlformats.org/drawingml/2006/wordprocessingDrawing" xmlns:w10="urn:schemas-microsoft-com:office:word" xmlns:w="http://schemas.openxmlformats.org/wordprocessingml/2006/main" xmlns:w14="http://schemas.microsoft.com/office/word/2010/wordml" xmlns:w15="http://schemas.microsoft.com/office/word/2012/wordml" xmlns:w16cex="http://schemas.microsoft.com/office/word/2018/wordml/cex" xmlns:w16cid="http://schemas.microsoft.com/office/word/2016/wordml/cid" xmlns:w16="http://schemas.microsoft.com/office/word/2018/wordml" xmlns:w16du="http://schemas.microsoft.com/office/word/2023/wordml/word16du" xmlns:w16sdtdh="http://schemas.microsoft.com/office/word/2020/wordml/sdtdatahash" xmlns:w16sdtfl="http://schemas.microsoft.com/office/word/2024/wordml/sdtformatlock" xmlns:w16se="http://schemas.microsoft.com/office/word/2015/wordml/symex" xmlns:wpg="http://schemas.microsoft.com/office/word/2010/wordprocessingGroup" xmlns:wpi="http://schemas.microsoft.com/office/word/2010/wordprocessingInk" xmlns:wne="http://schemas.microsoft.com/office/word/2006/wordml" xmlns:wps="http://schemas.microsoft.com/office/word/2010/wordprocessingShape" mc:Ignorable="w14 w15 w16se w16cid w16 w16cex w16sdtdh w16sdtfl w16du wp14">
   <w:body>
     <w:p>
       <w:pPr>
@@ -11,9 +11,8 @@
       </w:r>
     </w:p>
     <w:p>
-      <w:pPr/>
-      <w:r>
-        <w:t xml:space="preserve">Cập nhật ngày 09/10/2026</w:t>
+      <w:r>
+        <w:t xml:space="preserve">Cập nhật ngày 13/10/2026</w:t>
       </w:r>
     </w:p>
     <w:p>
@@ -25,7 +24,6 @@
       </w:r>
     </w:p>
     <w:p>
-      <w:pPr/>
       <w:r>
         <w:t xml:space="preserve">Phần mềm quản lý trọn quy trình của cơ sở: danh mục, kho theo lô, lệnh sản xuất, bán hàng – giao hàng, sổ biểu mẫu kiểm soát ATTP và (tuỳ chọn) đồng bộ sang HanoiCheck. Dùng ở hai nơi:</w:t>
       </w:r>
@@ -60,20 +58,18 @@
         <w:rPr>
           <w:b/>
         </w:rPr>
-        <w:t xml:space="preserve">App Android</w:t>
+        <w:t>App Android</w:t>
       </w:r>
       <w:r>
         <w:t xml:space="preserve"> (điện thoại): nhân viên sản xuất, giao hàng, nhập phiếu biểu mẫu, xem tồn kho.</w:t>
       </w:r>
     </w:p>
     <w:p>
-      <w:pPr/>
       <w:r>
         <w:t xml:space="preserve">HanoiCheck chỉ là một kênh bán. Cơ sở chưa kết nối thì mọi nghiệp vụ nội bộ vẫn chạy, các mục HanoiCheck tự ẩn.</w:t>
       </w:r>
     </w:p>
     <w:p>
-      <w:pPr/>
       <w:r>
         <w:t xml:space="preserve">Mỗi tài khoản có một hoặc nhiều vai trò; người nhiều vai trò thấy gộp các chức năng.</w:t>
       </w:r>
@@ -83,7 +79,7 @@
         <w:tblStyle w:val="TableGrid"/>
         <w:tblW w:w="0" w:type="auto"/>
         <w:tblLayout w:type="fixed"/>
-        <w:tblLook w:val="04A0" w:firstRow="1" w:lastRow="0" w:firstColumn="0" w:lastColumn="0" w:noHBand="0" w:noVBand="1"/>
+        <w:tblLook w:val="0420" w:firstRow="1" w:lastRow="0" w:firstColumn="0" w:lastColumn="0" w:noHBand="0" w:noVBand="1"/>
       </w:tblPr>
       <w:tblGrid>
         <w:gridCol w:w="3120"/>
@@ -100,7 +96,6 @@
             <w:shd w:val="clear" w:color="auto" w:fill="F2F2F2"/>
           </w:tcPr>
           <w:p>
-            <w:pPr/>
             <w:r>
               <w:t xml:space="preserve">Vai trò</w:t>
             </w:r>
@@ -112,7 +107,6 @@
             <w:shd w:val="clear" w:color="auto" w:fill="F2F2F2"/>
           </w:tcPr>
           <w:p>
-            <w:pPr/>
             <w:r>
               <w:t xml:space="preserve">Làm được gì</w:t>
             </w:r>
@@ -124,7 +118,6 @@
             <w:shd w:val="clear" w:color="auto" w:fill="F2F2F2"/>
           </w:tcPr>
           <w:p>
-            <w:pPr/>
             <w:r>
               <w:t xml:space="preserve">Dùng chủ yếu</w:t>
             </w:r>
@@ -137,7 +130,6 @@
             <w:tcW w:w="3120" w:type="dxa"/>
           </w:tcPr>
           <w:p>
-            <w:pPr/>
             <w:r>
               <w:t xml:space="preserve">Chủ cơ sở (Quản trị cơ sở)</w:t>
             </w:r>
@@ -148,7 +140,6 @@
             <w:tcW w:w="3120" w:type="dxa"/>
           </w:tcPr>
           <w:p>
-            <w:pPr/>
             <w:r>
               <w:t xml:space="preserve">Toàn quyền, gồm tạo tài khoản nhân viên và cài đặt kết nối HanoiCheck</w:t>
             </w:r>
@@ -159,9 +150,8 @@
             <w:tcW w:w="3120" w:type="dxa"/>
           </w:tcPr>
           <w:p>
-            <w:pPr/>
-            <w:r>
-              <w:t xml:space="preserve">Web + app</w:t>
+            <w:r>
+              <w:t>Web + app</w:t>
             </w:r>
           </w:p>
         </w:tc>
@@ -172,7 +162,6 @@
             <w:tcW w:w="3120" w:type="dxa"/>
           </w:tcPr>
           <w:p>
-            <w:pPr/>
             <w:r>
               <w:t xml:space="preserve">Nhân viên nhập liệu</w:t>
             </w:r>
@@ -183,7 +172,6 @@
             <w:tcW w:w="3120" w:type="dxa"/>
           </w:tcPr>
           <w:p>
-            <w:pPr/>
             <w:r>
               <w:t xml:space="preserve">Mọi màn nghiệp vụ và biểu mẫu, trừ cài đặt kết nối HanoiCheck</w:t>
             </w:r>
@@ -194,9 +182,8 @@
             <w:tcW w:w="3120" w:type="dxa"/>
           </w:tcPr>
           <w:p>
-            <w:pPr/>
-            <w:r>
-              <w:t xml:space="preserve">Web</w:t>
+            <w:r>
+              <w:t>Web</w:t>
             </w:r>
           </w:p>
         </w:tc>
@@ -207,7 +194,6 @@
             <w:tcW w:w="3120" w:type="dxa"/>
           </w:tcPr>
           <w:p>
-            <w:pPr/>
             <w:r>
               <w:t xml:space="preserve">Nhân viên sản xuất chế biến</w:t>
             </w:r>
@@ -218,7 +204,6 @@
             <w:tcW w:w="3120" w:type="dxa"/>
           </w:tcPr>
           <w:p>
-            <w:pPr/>
             <w:r>
               <w:t xml:space="preserve">Lệnh sản xuất (tham gia khâu, hoàn thành kèm ảnh), xem tồn kho</w:t>
             </w:r>
@@ -229,9 +214,8 @@
             <w:tcW w:w="3120" w:type="dxa"/>
           </w:tcPr>
           <w:p>
-            <w:pPr/>
-            <w:r>
-              <w:t xml:space="preserve">App</w:t>
+            <w:r>
+              <w:t>App</w:t>
             </w:r>
           </w:p>
         </w:tc>
@@ -242,7 +226,6 @@
             <w:tcW w:w="3120" w:type="dxa"/>
           </w:tcPr>
           <w:p>
-            <w:pPr/>
             <w:r>
               <w:t xml:space="preserve">Nhân viên giao hàng</w:t>
             </w:r>
@@ -253,7 +236,6 @@
             <w:tcW w:w="3120" w:type="dxa"/>
           </w:tcPr>
           <w:p>
-            <w:pPr/>
             <w:r>
               <w:t xml:space="preserve">Đơn hàng: nhận giao, xác nhận đã giao kèm ảnh</w:t>
             </w:r>
@@ -264,9 +246,8 @@
             <w:tcW w:w="3120" w:type="dxa"/>
           </w:tcPr>
           <w:p>
-            <w:pPr/>
-            <w:r>
-              <w:t xml:space="preserve">App</w:t>
+            <w:r>
+              <w:t>App</w:t>
             </w:r>
           </w:p>
         </w:tc>
@@ -277,7 +258,6 @@
             <w:tcW w:w="3120" w:type="dxa"/>
           </w:tcPr>
           <w:p>
-            <w:pPr/>
             <w:r>
               <w:t xml:space="preserve">Nhân viên nhập biểu mẫu</w:t>
             </w:r>
@@ -288,7 +268,6 @@
             <w:tcW w:w="3120" w:type="dxa"/>
           </w:tcPr>
           <w:p>
-            <w:pPr/>
             <w:r>
               <w:t xml:space="preserve">Nhập phiếu và xem phiếu của các biểu mẫu được giao</w:t>
             </w:r>
@@ -299,7 +278,6 @@
             <w:tcW w:w="3120" w:type="dxa"/>
           </w:tcPr>
           <w:p>
-            <w:pPr/>
             <w:r>
               <w:t xml:space="preserve">App (web cũng được)</w:t>
             </w:r>
@@ -308,7 +286,6 @@
       </w:tr>
     </w:tbl>
     <w:p>
-      <w:pPr/>
       <w:r>
         <w:t xml:space="preserve">Mọi người đều tự đổi được mật khẩu của mình (mục 2.3).</w:t>
       </w:r>
@@ -322,7 +299,6 @@
       </w:r>
     </w:p>
     <w:p>
-      <w:pPr/>
       <w:r>
         <w:t xml:space="preserve">Tài khoản nhân viên do Chủ cơ sở cấp (mục 3.2); tên đăng nhập là số điện thoại (hoặc email).</w:t>
       </w:r>
@@ -365,7 +341,7 @@
         <w:t xml:space="preserve">Đăng nhập</w:t>
       </w:r>
       <w:r>
-        <w:t xml:space="preserve">.</w:t>
+        <w:t>.</w:t>
       </w:r>
     </w:p>
     <w:p>
@@ -377,11 +353,11 @@
         </w:numPr>
       </w:pPr>
       <w:r>
+        <w:lastRenderedPageBreak/>
         <w:t xml:space="preserve">Menu bên trái hiện theo vai trò: Tổng quan, Danh mục, Kiểm soát ATTP, Kho &amp; Sản xuất, Bán hàng, và (nếu bật HanoiCheck) Nhật ký đồng bộ, Cài đặt kết nối.</w:t>
       </w:r>
     </w:p>
     <w:p>
-      <w:pPr/>
       <w:r>
         <w:t xml:space="preserve">Quên mật khẩu: báo Chủ cơ sở đặt lại ở màn Nhân sự.</w:t>
       </w:r>
@@ -430,10 +406,10 @@
         <w:rPr>
           <w:rStyle w:val="CodeChar"/>
         </w:rPr>
-        <w:t xml:space="preserve">https://quanly.tuannghiabakery.vn</w:t>
-      </w:r>
-      <w:r>
-        <w:t xml:space="preserve">.</w:t>
+        <w:t>https://quanly.tuannghiabakery.vn</w:t>
+      </w:r>
+      <w:r>
+        <w:t>.</w:t>
       </w:r>
     </w:p>
     <w:p>
@@ -498,7 +474,7 @@
         <w:rPr>
           <w:b/>
         </w:rPr>
-        <w:t xml:space="preserve">Web:</w:t>
+        <w:t>Web:</w:t>
       </w:r>
       <w:r>
         <w:t xml:space="preserve"> bấm biểu tượng chìa khoá góc trên bên phải.</w:t>
@@ -516,7 +492,7 @@
         <w:rPr>
           <w:b/>
         </w:rPr>
-        <w:t xml:space="preserve">App:</w:t>
+        <w:t>App:</w:t>
       </w:r>
       <w:r>
         <w:t xml:space="preserve"> bấm menu ba chấm góc trên → </w:t>
@@ -528,11 +504,10 @@
         <w:t xml:space="preserve">Đổi mật khẩu</w:t>
       </w:r>
       <w:r>
-        <w:t xml:space="preserve">.</w:t>
-      </w:r>
-    </w:p>
-    <w:p>
-      <w:pPr/>
+        <w:t>.</w:t>
+      </w:r>
+    </w:p>
+    <w:p>
       <w:r>
         <w:t xml:space="preserve">Nhập mật khẩu hiện tại, mật khẩu mới hai lần rồi lưu. Nhân viên nên đổi ngay sau lần đăng nhập đầu tiên.</w:t>
       </w:r>
@@ -546,7 +521,6 @@
       </w:r>
     </w:p>
     <w:p>
-      <w:pPr/>
       <w:r>
         <w:t xml:space="preserve">Làm một lần khi bắt đầu, theo thứ tự: khai danh mục (mục 4) → nhân sự và tài khoản → thông tin in biểu mẫu → kết nối HanoiCheck (nếu dùng).</w:t>
       </w:r>
@@ -560,7 +534,6 @@
       </w:r>
     </w:p>
     <w:p>
-      <w:pPr/>
       <w:r>
         <w:rPr>
           <w:b/>
@@ -572,7 +545,6 @@
       </w:r>
     </w:p>
     <w:p>
-      <w:pPr/>
       <w:r>
         <w:t xml:space="preserve">Nhân viên nghỉ: bấm </w:t>
       </w:r>
@@ -685,7 +657,6 @@
       </w:r>
     </w:p>
     <w:p>
-      <w:pPr/>
       <w:r>
         <w:t xml:space="preserve">Đặt lại mật khẩu: mở lại hồ sơ, nhập mật khẩu mới ở ô "Đặt lại mật khẩu" (để trống = không đổi). Tạm khoá: tắt "Cho phép đăng nhập".</w:t>
       </w:r>
@@ -695,11 +666,11 @@
         <w:pStyle w:val="Heading3"/>
       </w:pPr>
       <w:r>
+        <w:lastRenderedPageBreak/>
         <w:t xml:space="preserve">3.3. Thông tin in trên biểu mẫu</w:t>
       </w:r>
     </w:p>
     <w:p>
-      <w:pPr/>
       <w:r>
         <w:rPr>
           <w:b/>
@@ -751,7 +722,7 @@
         <w:t xml:space="preserve">Kiểm tra kết nối</w:t>
       </w:r>
       <w:r>
-        <w:t xml:space="preserve">.</w:t>
+        <w:t>.</w:t>
       </w:r>
     </w:p>
     <w:p>
@@ -793,7 +764,7 @@
         <w:t xml:space="preserve">Đẩy toàn bộ danh mục</w:t>
       </w:r>
       <w:r>
-        <w:t xml:space="preserve">.</w:t>
+        <w:t>.</w:t>
       </w:r>
     </w:p>
     <w:p>
@@ -826,7 +797,6 @@
       </w:r>
     </w:p>
     <w:p>
-      <w:pPr/>
       <w:r>
         <w:t xml:space="preserve">Danh mục là dữ liệu nền, khai một lần rồi dùng lại cho kho, sản xuất, bán hàng. Mọi màn đều có nút Thêm, Sửa và Xoá trên từng dòng; mã đã cấp không sửa được. Chủ cơ sở và nhân viên nhập liệu làm trên web; tab </w:t>
       </w:r>
@@ -841,7 +811,6 @@
       </w:r>
     </w:p>
     <w:p>
-      <w:pPr/>
       <w:r>
         <w:t xml:space="preserve">Khai theo thứ tự trong bảng:</w:t>
       </w:r>
@@ -851,7 +820,7 @@
         <w:tblStyle w:val="TableGrid"/>
         <w:tblW w:w="0" w:type="auto"/>
         <w:tblLayout w:type="fixed"/>
-        <w:tblLook w:val="04A0" w:firstRow="1" w:lastRow="0" w:firstColumn="0" w:lastColumn="0" w:noHBand="0" w:noVBand="1"/>
+        <w:tblLook w:val="0420" w:firstRow="1" w:lastRow="0" w:firstColumn="0" w:lastColumn="0" w:noHBand="0" w:noVBand="1"/>
       </w:tblPr>
       <w:tblGrid>
         <w:gridCol w:w="2340"/>
@@ -869,9 +838,8 @@
             <w:shd w:val="clear" w:color="auto" w:fill="F2F2F2"/>
           </w:tcPr>
           <w:p>
-            <w:pPr/>
-            <w:r>
-              <w:t xml:space="preserve">#</w:t>
+            <w:r>
+              <w:t>#</w:t>
             </w:r>
           </w:p>
         </w:tc>
@@ -881,7 +849,6 @@
             <w:shd w:val="clear" w:color="auto" w:fill="F2F2F2"/>
           </w:tcPr>
           <w:p>
-            <w:pPr/>
             <w:r>
               <w:t xml:space="preserve">Màn (menu)</w:t>
             </w:r>
@@ -893,7 +860,6 @@
             <w:shd w:val="clear" w:color="auto" w:fill="F2F2F2"/>
           </w:tcPr>
           <w:p>
-            <w:pPr/>
             <w:r>
               <w:t xml:space="preserve">Khai gì</w:t>
             </w:r>
@@ -905,7 +871,6 @@
             <w:shd w:val="clear" w:color="auto" w:fill="F2F2F2"/>
           </w:tcPr>
           <w:p>
-            <w:pPr/>
             <w:r>
               <w:t xml:space="preserve">Bắt buộc?</w:t>
             </w:r>
@@ -918,9 +883,8 @@
             <w:tcW w:w="2340" w:type="dxa"/>
           </w:tcPr>
           <w:p>
-            <w:pPr/>
-            <w:r>
-              <w:t xml:space="preserve">1</w:t>
+            <w:r>
+              <w:t>1</w:t>
             </w:r>
           </w:p>
         </w:tc>
@@ -929,7 +893,6 @@
             <w:tcW w:w="2340" w:type="dxa"/>
           </w:tcPr>
           <w:p>
-            <w:pPr/>
             <w:r>
               <w:t xml:space="preserve">Danh mục → Kho</w:t>
             </w:r>
@@ -940,7 +903,6 @@
             <w:tcW w:w="2340" w:type="dxa"/>
           </w:tcPr>
           <w:p>
-            <w:pPr/>
             <w:r>
               <w:t xml:space="preserve">Mã kho (vd KHO01), tên, địa chỉ, diện tích</w:t>
             </w:r>
@@ -951,9 +913,8 @@
             <w:tcW w:w="2340" w:type="dxa"/>
           </w:tcPr>
           <w:p>
-            <w:pPr/>
-            <w:r>
-              <w:t xml:space="preserve">Có</w:t>
+            <w:r>
+              <w:t>Có</w:t>
             </w:r>
           </w:p>
         </w:tc>
@@ -964,9 +925,8 @@
             <w:tcW w:w="2340" w:type="dxa"/>
           </w:tcPr>
           <w:p>
-            <w:pPr/>
-            <w:r>
-              <w:t xml:space="preserve">2</w:t>
+            <w:r>
+              <w:t>2</w:t>
             </w:r>
           </w:p>
         </w:tc>
@@ -975,7 +935,6 @@
             <w:tcW w:w="2340" w:type="dxa"/>
           </w:tcPr>
           <w:p>
-            <w:pPr/>
             <w:r>
               <w:t xml:space="preserve">Danh mục → Cơ sở sản xuất</w:t>
             </w:r>
@@ -986,7 +945,6 @@
             <w:tcW w:w="2340" w:type="dxa"/>
           </w:tcPr>
           <w:p>
-            <w:pPr/>
             <w:r>
               <w:t xml:space="preserve">Xưởng/địa điểm sản xuất (mã tự sinh CS-0001…)</w:t>
             </w:r>
@@ -997,9 +955,8 @@
             <w:tcW w:w="2340" w:type="dxa"/>
           </w:tcPr>
           <w:p>
-            <w:pPr/>
-            <w:r>
-              <w:t xml:space="preserve">Có</w:t>
+            <w:r>
+              <w:t>Có</w:t>
             </w:r>
           </w:p>
         </w:tc>
@@ -1010,9 +967,8 @@
             <w:tcW w:w="2340" w:type="dxa"/>
           </w:tcPr>
           <w:p>
-            <w:pPr/>
-            <w:r>
-              <w:t xml:space="preserve">3</w:t>
+            <w:r>
+              <w:t>3</w:t>
             </w:r>
           </w:p>
         </w:tc>
@@ -1021,7 +977,6 @@
             <w:tcW w:w="2340" w:type="dxa"/>
           </w:tcPr>
           <w:p>
-            <w:pPr/>
             <w:r>
               <w:t xml:space="preserve">Danh mục → Khâu sản xuất</w:t>
             </w:r>
@@ -1032,7 +987,6 @@
             <w:tcW w:w="2340" w:type="dxa"/>
           </w:tcPr>
           <w:p>
-            <w:pPr/>
             <w:r>
               <w:t xml:space="preserve">Các công đoạn: Sơ chế, Trộn, Nướng, Đóng gói…</w:t>
             </w:r>
@@ -1043,9 +997,8 @@
             <w:tcW w:w="2340" w:type="dxa"/>
           </w:tcPr>
           <w:p>
-            <w:pPr/>
-            <w:r>
-              <w:t xml:space="preserve">Có</w:t>
+            <w:r>
+              <w:t>Có</w:t>
             </w:r>
           </w:p>
         </w:tc>
@@ -1056,9 +1009,8 @@
             <w:tcW w:w="2340" w:type="dxa"/>
           </w:tcPr>
           <w:p>
-            <w:pPr/>
-            <w:r>
-              <w:t xml:space="preserve">4</w:t>
+            <w:r>
+              <w:t>4</w:t>
             </w:r>
           </w:p>
         </w:tc>
@@ -1067,7 +1019,6 @@
             <w:tcW w:w="2340" w:type="dxa"/>
           </w:tcPr>
           <w:p>
-            <w:pPr/>
             <w:r>
               <w:t xml:space="preserve">Danh mục → Quy trình sản xuất</w:t>
             </w:r>
@@ -1078,7 +1029,6 @@
             <w:tcW w:w="2340" w:type="dxa"/>
           </w:tcPr>
           <w:p>
-            <w:pPr/>
             <w:r>
               <w:t xml:space="preserve">Ghép các khâu theo thứ tự</w:t>
             </w:r>
@@ -1089,9 +1039,8 @@
             <w:tcW w:w="2340" w:type="dxa"/>
           </w:tcPr>
           <w:p>
-            <w:pPr/>
-            <w:r>
-              <w:t xml:space="preserve">Có</w:t>
+            <w:r>
+              <w:t>Có</w:t>
             </w:r>
           </w:p>
         </w:tc>
@@ -1102,9 +1051,8 @@
             <w:tcW w:w="2340" w:type="dxa"/>
           </w:tcPr>
           <w:p>
-            <w:pPr/>
-            <w:r>
-              <w:t xml:space="preserve">5</w:t>
+            <w:r>
+              <w:t>5</w:t>
             </w:r>
           </w:p>
         </w:tc>
@@ -1113,7 +1061,6 @@
             <w:tcW w:w="2340" w:type="dxa"/>
           </w:tcPr>
           <w:p>
-            <w:pPr/>
             <w:r>
               <w:t xml:space="preserve">Danh mục → Nhà cung ứng đầu vào</w:t>
             </w:r>
@@ -1124,7 +1071,6 @@
             <w:tcW w:w="2340" w:type="dxa"/>
           </w:tcPr>
           <w:p>
-            <w:pPr/>
             <w:r>
               <w:t xml:space="preserve">NCC nguyên liệu (truy xuất nguồn gốc)</w:t>
             </w:r>
@@ -1135,7 +1081,6 @@
             <w:tcW w:w="2340" w:type="dxa"/>
           </w:tcPr>
           <w:p>
-            <w:pPr/>
             <w:r>
               <w:t xml:space="preserve">Nên có</w:t>
             </w:r>
@@ -1148,9 +1093,8 @@
             <w:tcW w:w="2340" w:type="dxa"/>
           </w:tcPr>
           <w:p>
-            <w:pPr/>
-            <w:r>
-              <w:t xml:space="preserve">6</w:t>
+            <w:r>
+              <w:t>6</w:t>
             </w:r>
           </w:p>
         </w:tc>
@@ -1159,7 +1103,6 @@
             <w:tcW w:w="2340" w:type="dxa"/>
           </w:tcPr>
           <w:p>
-            <w:pPr/>
             <w:r>
               <w:t xml:space="preserve">Danh mục → Nhân sự</w:t>
             </w:r>
@@ -1170,7 +1113,6 @@
             <w:tcW w:w="2340" w:type="dxa"/>
           </w:tcPr>
           <w:p>
-            <w:pPr/>
             <w:r>
               <w:t xml:space="preserve">Hồ sơ + tài khoản (mục 3.1–3.2)</w:t>
             </w:r>
@@ -1181,9 +1123,8 @@
             <w:tcW w:w="2340" w:type="dxa"/>
           </w:tcPr>
           <w:p>
-            <w:pPr/>
-            <w:r>
-              <w:t xml:space="preserve">Có</w:t>
+            <w:r>
+              <w:t>Có</w:t>
             </w:r>
           </w:p>
         </w:tc>
@@ -1194,9 +1135,8 @@
             <w:tcW w:w="2340" w:type="dxa"/>
           </w:tcPr>
           <w:p>
-            <w:pPr/>
-            <w:r>
-              <w:t xml:space="preserve">7</w:t>
+            <w:r>
+              <w:t>7</w:t>
             </w:r>
           </w:p>
         </w:tc>
@@ -1205,7 +1145,6 @@
             <w:tcW w:w="2340" w:type="dxa"/>
           </w:tcPr>
           <w:p>
-            <w:pPr/>
             <w:r>
               <w:t xml:space="preserve">Danh mục → Thực phẩm / SKU</w:t>
             </w:r>
@@ -1216,7 +1155,6 @@
             <w:tcW w:w="2340" w:type="dxa"/>
           </w:tcPr>
           <w:p>
-            <w:pPr/>
             <w:r>
               <w:t xml:space="preserve">Nguyên liệu và thành phẩm (xem dưới)</w:t>
             </w:r>
@@ -1227,9 +1165,8 @@
             <w:tcW w:w="2340" w:type="dxa"/>
           </w:tcPr>
           <w:p>
-            <w:pPr/>
-            <w:r>
-              <w:t xml:space="preserve">Có</w:t>
+            <w:r>
+              <w:t>Có</w:t>
             </w:r>
           </w:p>
         </w:tc>
@@ -1240,9 +1177,8 @@
             <w:tcW w:w="2340" w:type="dxa"/>
           </w:tcPr>
           <w:p>
-            <w:pPr/>
-            <w:r>
-              <w:t xml:space="preserve">8</w:t>
+            <w:r>
+              <w:t>8</w:t>
             </w:r>
           </w:p>
         </w:tc>
@@ -1251,7 +1187,6 @@
             <w:tcW w:w="2340" w:type="dxa"/>
           </w:tcPr>
           <w:p>
-            <w:pPr/>
             <w:r>
               <w:t xml:space="preserve">Kho &amp; Sản xuất → Định mức</w:t>
             </w:r>
@@ -1262,7 +1197,6 @@
             <w:tcW w:w="2340" w:type="dxa"/>
           </w:tcPr>
           <w:p>
-            <w:pPr/>
             <w:r>
               <w:t xml:space="preserve">Công thức nguyên liệu cho mỗi thành phẩm</w:t>
             </w:r>
@@ -1273,7 +1207,6 @@
             <w:tcW w:w="2340" w:type="dxa"/>
           </w:tcPr>
           <w:p>
-            <w:pPr/>
             <w:r>
               <w:t xml:space="preserve">Có, để lập lệnh</w:t>
             </w:r>
@@ -1286,9 +1219,9 @@
             <w:tcW w:w="2340" w:type="dxa"/>
           </w:tcPr>
           <w:p>
-            <w:pPr/>
-            <w:r>
-              <w:t xml:space="preserve">9</w:t>
+            <w:r>
+              <w:lastRenderedPageBreak/>
+              <w:t>9</w:t>
             </w:r>
           </w:p>
         </w:tc>
@@ -1297,7 +1230,6 @@
             <w:tcW w:w="2340" w:type="dxa"/>
           </w:tcPr>
           <w:p>
-            <w:pPr/>
             <w:r>
               <w:t xml:space="preserve">Bán hàng → Khách hàng</w:t>
             </w:r>
@@ -1308,7 +1240,6 @@
             <w:tcW w:w="2340" w:type="dxa"/>
           </w:tcPr>
           <w:p>
-            <w:pPr/>
             <w:r>
               <w:t xml:space="preserve">Cửa hàng, đại lý, khách lẻ, trường học</w:t>
             </w:r>
@@ -1319,7 +1250,6 @@
             <w:tcW w:w="2340" w:type="dxa"/>
           </w:tcPr>
           <w:p>
-            <w:pPr/>
             <w:r>
               <w:t xml:space="preserve">Có, để bán</w:t>
             </w:r>
@@ -1332,9 +1262,8 @@
             <w:tcW w:w="2340" w:type="dxa"/>
           </w:tcPr>
           <w:p>
-            <w:pPr/>
-            <w:r>
-              <w:t xml:space="preserve">10</w:t>
+            <w:r>
+              <w:t>10</w:t>
             </w:r>
           </w:p>
         </w:tc>
@@ -1343,7 +1272,6 @@
             <w:tcW w:w="2340" w:type="dxa"/>
           </w:tcPr>
           <w:p>
-            <w:pPr/>
             <w:r>
               <w:t xml:space="preserve">Danh mục → Lô sản xuất, Món ăn</w:t>
             </w:r>
@@ -1354,7 +1282,6 @@
             <w:tcW w:w="2340" w:type="dxa"/>
           </w:tcPr>
           <w:p>
-            <w:pPr/>
             <w:r>
               <w:t xml:space="preserve">Lô (truy xuất), món ăn suất ăn</w:t>
             </w:r>
@@ -1365,7 +1292,6 @@
             <w:tcW w:w="2340" w:type="dxa"/>
           </w:tcPr>
           <w:p>
-            <w:pPr/>
             <w:r>
               <w:t xml:space="preserve">Chỉ khi dùng HanoiCheck</w:t>
             </w:r>
@@ -1462,7 +1388,6 @@
       </w:r>
     </w:p>
     <w:p>
-      <w:pPr/>
       <w:r>
         <w:t xml:space="preserve">Chọn thành phẩm → </w:t>
       </w:r>
@@ -1489,14 +1414,13 @@
       <w:pPr>
         <w:pStyle w:val="Code"/>
       </w:pPr>
-      <w:bookmarkStart w:id="1" w:name="bongo_lang_latex_1"/>
-      <w:bookmarkEnd w:id="1"/>
+      <w:bookmarkStart w:id="0" w:name="bongo_lang_latex_1"/>
+      <w:bookmarkEnd w:id="0"/>
       <w:r>
         <w:t xml:space="preserve">\text{Nguyên liệu cần} = \text{Định lượng} \times \text{Số lượng SX} \times (1 + \text{Hao hụt \%})</w:t>
       </w:r>
     </w:p>
     <w:p>
-      <w:pPr/>
       <w:r>
         <w:t xml:space="preserve">Ví dụ: 30 bánh mì, 0,1 kg bột/cái, hao hụt 10% → trừ 3,3 kg bột.</w:t>
       </w:r>
@@ -1510,7 +1434,6 @@
       </w:r>
     </w:p>
     <w:p>
-      <w:pPr/>
       <w:r>
         <w:t xml:space="preserve">Kho quản lý theo lô: mỗi lần nhập là một lô có hạn dùng riêng. Mọi thao tác trừ kho (sản xuất, bán hàng) tự lấy lô hết hạn sớm nhất trước (FEFO).</w:t>
       </w:r>
@@ -1524,7 +1447,6 @@
       </w:r>
     </w:p>
     <w:p>
-      <w:pPr/>
       <w:r>
         <w:rPr>
           <w:b/>
@@ -1538,10 +1460,10 @@
         <w:rPr>
           <w:b/>
         </w:rPr>
-        <w:t xml:space="preserve">Kho</w:t>
-      </w:r>
-      <w:r>
-        <w:t xml:space="preserve">).</w:t>
+        <w:t>Kho</w:t>
+      </w:r>
+      <w:r>
+        <w:t>).</w:t>
       </w:r>
     </w:p>
     <w:p>
@@ -1586,7 +1508,7 @@
         <w:t xml:space="preserve">Nhập kho</w:t>
       </w:r>
       <w:r>
-        <w:t xml:space="preserve">.</w:t>
+        <w:t>.</w:t>
       </w:r>
     </w:p>
     <w:p>
@@ -1608,7 +1530,6 @@
       </w:r>
     </w:p>
     <w:p>
-      <w:pPr/>
       <w:r>
         <w:t xml:space="preserve">Nhân viên sản xuất chỉ xem tồn; nhân viên nhập liệu nhập/kiểm kê được cả trên app.</w:t>
       </w:r>
@@ -1622,7 +1543,6 @@
       </w:r>
     </w:p>
     <w:p>
-      <w:pPr/>
       <w:r>
         <w:rPr>
           <w:b/>
@@ -1663,6 +1583,7 @@
         </w:numPr>
       </w:pPr>
       <w:r>
+        <w:lastRenderedPageBreak/>
         <w:t xml:space="preserve">Mỗi khâu chọn </w:t>
       </w:r>
       <w:r>
@@ -1681,7 +1602,7 @@
         <w:t xml:space="preserve">Gán người cho TẤT CẢ khâu</w:t>
       </w:r>
       <w:r>
-        <w:t xml:space="preserve">.</w:t>
+        <w:t>.</w:t>
       </w:r>
     </w:p>
     <w:p>
@@ -1735,11 +1656,10 @@
         <w:t xml:space="preserve">Tạo lệnh</w:t>
       </w:r>
       <w:r>
-        <w:t xml:space="preserve"> → nhân viên sản xuất nhận thông báo trên app.</w:t>
-      </w:r>
-    </w:p>
-    <w:p>
-      <w:pPr/>
+        <w:t xml:space="preserve"> → nhân viên sản xuất nhận thông báo trên app. Danh sách lệnh mặc định hiện 30 ngày gần nhất; dùng bộ lọc Từ ngày – Đến ngày và Trạng thái để xem thêm.</w:t>
+      </w:r>
+    </w:p>
+    <w:p>
       <w:r>
         <w:rPr>
           <w:b/>
@@ -1870,7 +1790,6 @@
       </w:r>
     </w:p>
     <w:p>
-      <w:pPr/>
       <w:r>
         <w:t xml:space="preserve">Nhân viên sản xuất chỉ hoàn thành được lệnh mình có tham gia ít nhất một khâu. Chủ cơ sở và nhập liệu hoàn thành được mọi lệnh, trên cả web.</w:t>
       </w:r>
@@ -1928,7 +1847,7 @@
         <w:rPr>
           <w:b/>
         </w:rPr>
-        <w:t xml:space="preserve">Huỷ</w:t>
+        <w:t>Huỷ</w:t>
       </w:r>
       <w:r>
         <w:t xml:space="preserve"> được, bắt buộc nhập lý do. Hệ thống trả nguyên liệu về đúng lô và thu hồi thành phẩm.</w:t>
@@ -1943,7 +1862,6 @@
       </w:r>
     </w:p>
     <w:p>
-      <w:pPr/>
       <w:r>
         <w:t xml:space="preserve">Mọi đơn – khách lẻ, đại lý hay trường học qua HanoiCheck – đều là một </w:t>
       </w:r>
@@ -1966,7 +1884,6 @@
       </w:r>
     </w:p>
     <w:p>
-      <w:pPr/>
       <w:r>
         <w:rPr>
           <w:b/>
@@ -2046,7 +1963,7 @@
         <w:t xml:space="preserve">Đang giao</w:t>
       </w:r>
       <w:r>
-        <w:t xml:space="preserve">.</w:t>
+        <w:t>.</w:t>
       </w:r>
     </w:p>
     <w:p>
@@ -2089,7 +2006,6 @@
       </w:r>
     </w:p>
     <w:p>
-      <w:pPr/>
       <w:r>
         <w:t xml:space="preserve">Đơn đã xuất kho vẫn </w:t>
       </w:r>
@@ -2097,18 +2013,18 @@
         <w:rPr>
           <w:b/>
         </w:rPr>
-        <w:t xml:space="preserve">Huỷ</w:t>
+        <w:t>Huỷ</w:t>
       </w:r>
       <w:r>
         <w:t xml:space="preserve"> được: hàng trả về đúng lô. Mở form Sửa luôn tải lại dữ liệu mới nhất của đơn.</w:t>
       </w:r>
     </w:p>
     <w:p>
-      <w:pPr/>
-      <w:r>
-        <w:rPr>
-          <w:b/>
-        </w:rPr>
+      <w:r>
+        <w:rPr>
+          <w:b/>
+        </w:rPr>
+        <w:lastRenderedPageBreak/>
         <w:t xml:space="preserve">Mã QR đơn:</w:t>
       </w:r>
       <w:r>
@@ -2118,7 +2034,7 @@
         <w:rPr>
           <w:b/>
         </w:rPr>
-        <w:t xml:space="preserve">In</w:t>
+        <w:t>In</w:t>
       </w:r>
       <w:r>
         <w:t xml:space="preserve"> tem dán lên hàng. Tem in kèm sản phẩm, số lượng, ngày hẹn giao, địa chỉ, thông tin lệnh sản xuất. Quét QR mở trang tra cứu công khai của đơn và các lô hàng.</w:t>
@@ -2133,7 +2049,6 @@
       </w:r>
     </w:p>
     <w:p>
-      <w:pPr/>
       <w:r>
         <w:rPr>
           <w:b/>
@@ -2305,11 +2220,10 @@
         <w:t xml:space="preserve">Hoàn thành giao hàng</w:t>
       </w:r>
       <w:r>
-        <w:t xml:space="preserve">, bắt buộc chụp ít nhất 1 ảnh. Đơn trường học: ảnh được gửi sang HanoiCheck.</w:t>
-      </w:r>
-    </w:p>
-    <w:p>
-      <w:pPr/>
+        <w:t xml:space="preserve">, bắt buộc chụp ít nhất 1 ảnh (tối đa 10). Đơn trường học: 3 ảnh đầu được gửi sang HanoiCheck.</w:t>
+      </w:r>
+    </w:p>
+    <w:p>
       <w:r>
         <w:t xml:space="preserve">Chủ cơ sở trên app không thấy hai mục Chờ giao hàng / Của tôi (mặc định mở </w:t>
       </w:r>
@@ -2332,7 +2246,6 @@
       </w:r>
     </w:p>
     <w:p>
-      <w:pPr/>
       <w:r>
         <w:t xml:space="preserve">Thay sổ giấy GMP/ISO/HACCP: nhân viên nhập phiếu trên app hoặc web, ký tay khi hoàn thành, hệ thống in PDF đúng mẫu giấy có mã QR đối chiếu và lập báo cáo tháng. Dữ liệu biểu mẫu là hồ sơ nội bộ, không gửi HanoiCheck. Web: menu </w:t>
       </w:r>
@@ -2364,7 +2277,6 @@
       </w:r>
     </w:p>
     <w:p>
-      <w:pPr/>
       <w:r>
         <w:rPr>
           <w:b/>
@@ -2390,7 +2302,7 @@
         <w:t xml:space="preserve">Nạp biểu mẫu mẫu</w:t>
       </w:r>
       <w:r>
-        <w:t xml:space="preserve"> để có sẵn 10 mẫu theo sổ giấy (tủ đông/mát, đèn UV, vệ sinh xe, checklist vệ sinh, tiếp nhận nguyên liệu, nướng bánh, sản phẩm không phù hợp, bẫy côn trùng, thiết bị đo, bảo dưỡng). Bấm lại vẫn an toàn.</w:t>
+        <w:t xml:space="preserve"> để có sẵn 10 mẫu theo sổ giấy (tủ đông/mát, đèn UV, vệ sinh xe, checklist vệ sinh, tiếp nhận nguyên liệu, nướng bánh, sản phẩm không phù hợp, bẫy côn trùng, thiết bị đo, bảo dưỡng). Bấm lại vẫn an toàn. Riêng mẫu “Tiếp nhận nguyên liệu NCC” đã bật “Đẩy vào kho khi hoàn thành”: mỗi dòng đạt (chọn nguyên liệu + số lượng ở dòng, chọn kho ở đầu phiếu) tự tạo một phiếu nhập kho nguyên liệu, mã lô tự sinh; dòng Không đạt được bỏ qua.</w:t>
       </w:r>
     </w:p>
     <w:p>
@@ -2429,10 +2341,10 @@
         <w:rPr>
           <w:b/>
         </w:rPr>
-        <w:t xml:space="preserve">trường</w:t>
-      </w:r>
-      <w:r>
-        <w:t xml:space="preserve">: Chữ, Số (có đơn vị, giá trị chuẩn), Giờ, Ngày, Đạt/Không đạt, Chọn nhân sự/sản phẩm/NCC/cơ sở, Lựa chọn, Ảnh.</w:t>
+        <w:t>trường</w:t>
+      </w:r>
+      <w:r>
+        <w:t xml:space="preserve">: Chữ, Số (có đơn vị, giá trị chuẩn), Giờ, Ngày, Đạt/Không đạt, Chọn nhân sự/sản phẩm/nguyên liệu/NCC/cơ sở/kho, Lựa chọn, Ảnh.</w:t>
       </w:r>
     </w:p>
     <w:p>
@@ -2459,7 +2371,7 @@
         <w:rPr>
           <w:b/>
         </w:rPr>
-        <w:t xml:space="preserve">Nhóm</w:t>
+        <w:t>Nhóm</w:t>
       </w:r>
       <w:r>
         <w:t xml:space="preserve"> (vd Buổi sáng / Buổi chiều), </w:t>
@@ -2484,7 +2396,6 @@
       </w:r>
     </w:p>
     <w:p>
-      <w:pPr/>
       <w:r>
         <w:t xml:space="preserve">Sửa mẫu không mất phiếu cũ. Mẫu đã có phiếu không xoá được, chỉ bỏ tick Kích hoạt. Giao mẫu cho nhân viên: mục 3.2.</w:t>
       </w:r>
@@ -2494,6 +2405,7 @@
         <w:pStyle w:val="Heading3"/>
       </w:pPr>
       <w:r>
+        <w:lastRenderedPageBreak/>
         <w:t xml:space="preserve">7.2. Nhập phiếu (nhân viên)</w:t>
       </w:r>
     </w:p>
@@ -2509,7 +2421,7 @@
         <w:rPr>
           <w:b/>
         </w:rPr>
-        <w:t xml:space="preserve">App:</w:t>
+        <w:t>App:</w:t>
       </w:r>
       <w:r>
         <w:t xml:space="preserve"> tab Biểu mẫu → Nhập phiếu. Mỗi mẫu báo trạng thái hôm nay: Chưa nhập (xám), Đang nhập dở (cam), Đã nhập (xanh). </w:t>
@@ -2518,7 +2430,7 @@
         <w:rPr>
           <w:b/>
         </w:rPr>
-        <w:t xml:space="preserve">Web:</w:t>
+        <w:t>Web:</w:t>
       </w:r>
       <w:r>
         <w:t xml:space="preserve"> Kiểm soát ATTP → Nhập phiếu, chọn mẫu và ngày.</w:t>
@@ -2594,7 +2506,6 @@
       </w:r>
     </w:p>
     <w:p>
-      <w:pPr/>
       <w:r>
         <w:t xml:space="preserve">Tự điền người: nhập một ô thì ô "Người kiểm tra" còn trống cùng dòng, cùng nhóm tự điền tên bạn. Hai người cùng sửa một phiếu thì người lưu sau được nhắc tải lại, không ghi đè nhau.</w:t>
       </w:r>
@@ -2706,7 +2617,6 @@
       </w:r>
     </w:p>
     <w:p>
-      <w:pPr/>
       <w:r>
         <w:t xml:space="preserve">PDF phiếu đã ký có khối người lập &amp; ký, hình chữ ký và mã QR. Cán bộ kiểm tra quét QR (không cần tài khoản) để xem bản gốc trên hệ thống:</w:t>
       </w:r>
@@ -2716,7 +2626,7 @@
         <w:tblStyle w:val="TableGrid"/>
         <w:tblW w:w="0" w:type="auto"/>
         <w:tblLayout w:type="fixed"/>
-        <w:tblLook w:val="04A0" w:firstRow="1" w:lastRow="0" w:firstColumn="0" w:lastColumn="0" w:noHBand="0" w:noVBand="1"/>
+        <w:tblLook w:val="0420" w:firstRow="1" w:lastRow="0" w:firstColumn="0" w:lastColumn="0" w:noHBand="0" w:noVBand="1"/>
       </w:tblPr>
       <w:tblGrid>
         <w:gridCol w:w="4680"/>
@@ -2732,7 +2642,6 @@
             <w:shd w:val="clear" w:color="auto" w:fill="F2F2F2"/>
           </w:tcPr>
           <w:p>
-            <w:pPr/>
             <w:r>
               <w:t xml:space="preserve">Trang đối chiếu báo</w:t>
             </w:r>
@@ -2744,7 +2653,6 @@
             <w:shd w:val="clear" w:color="auto" w:fill="F2F2F2"/>
           </w:tcPr>
           <w:p>
-            <w:pPr/>
             <w:r>
               <w:t xml:space="preserve">Ý nghĩa</w:t>
             </w:r>
@@ -2757,7 +2665,6 @@
             <w:tcW w:w="4680" w:type="dxa"/>
           </w:tcPr>
           <w:p>
-            <w:pPr/>
             <w:r>
               <w:t xml:space="preserve">✓ Bản PDF này đúng là bản đã ký, dữ liệu trên hệ thống chưa bị thay đổi</w:t>
             </w:r>
@@ -2768,7 +2675,6 @@
             <w:tcW w:w="4680" w:type="dxa"/>
           </w:tcPr>
           <w:p>
-            <w:pPr/>
             <w:r>
               <w:t xml:space="preserve">Đúng bản gốc. Chỉ cần so số liệu trên giấy với trang</w:t>
             </w:r>
@@ -2781,7 +2687,6 @@
             <w:tcW w:w="4680" w:type="dxa"/>
           </w:tcPr>
           <w:p>
-            <w:pPr/>
             <w:r>
               <w:t xml:space="preserve">⚠ Bản PDF bạn đang quét KHÔNG phải bản đang lưu trên hệ thống</w:t>
             </w:r>
@@ -2792,7 +2697,6 @@
             <w:tcW w:w="4680" w:type="dxa"/>
           </w:tcPr>
           <w:p>
-            <w:pPr/>
             <w:r>
               <w:t xml:space="preserve">Phiếu đã sửa và ký lại sau khi in, hoặc PDF không do hệ thống tạo</w:t>
             </w:r>
@@ -2805,7 +2709,6 @@
             <w:tcW w:w="4680" w:type="dxa"/>
           </w:tcPr>
           <w:p>
-            <w:pPr/>
             <w:r>
               <w:t xml:space="preserve">⚠ Dữ liệu trên hệ thống đã bị thay đổi sau khi ký</w:t>
             </w:r>
@@ -2816,7 +2719,6 @@
             <w:tcW w:w="4680" w:type="dxa"/>
           </w:tcPr>
           <w:p>
-            <w:pPr/>
             <w:r>
               <w:t xml:space="preserve">Dữ liệu bị sửa ngoài phần mềm – cần đối chiếu với cơ sở</w:t>
             </w:r>
@@ -2829,7 +2731,6 @@
             <w:tcW w:w="4680" w:type="dxa"/>
           </w:tcPr>
           <w:p>
-            <w:pPr/>
             <w:r>
               <w:t xml:space="preserve">Phiếu này chưa được ký</w:t>
             </w:r>
@@ -2840,7 +2741,6 @@
             <w:tcW w:w="4680" w:type="dxa"/>
           </w:tcPr>
           <w:p>
-            <w:pPr/>
             <w:r>
               <w:t xml:space="preserve">Phiếu nháp, hoặc hoàn thành trước khi có chức năng ký</w:t>
             </w:r>
@@ -2849,13 +2749,11 @@
       </w:tr>
     </w:tbl>
     <w:p>
-      <w:pPr/>
       <w:r>
         <w:t xml:space="preserve">Trang không đọc được chữ in trên giấy, nên vẫn cần so số liệu, người ký, giờ ký. PDF in trước 09/10/2026 nên in lại để có QR mới. Đây là chữ ký điện tử nội bộ; hồ sơ gửi cơ quan cần giá trị pháp lý cao nhất thì ký thêm file PDF bằng chữ ký số (USB token) của công ty.</w:t>
       </w:r>
     </w:p>
     <w:p>
-      <w:pPr/>
       <w:r>
         <w:t xml:space="preserve">Chi tiết từng bước: tài liệu riêng "Hướng dẫn sử dụng – Biểu mẫu kiểm soát ATTP".</w:t>
       </w:r>
@@ -2865,6 +2763,7 @@
         <w:pStyle w:val="Heading2"/>
       </w:pPr>
       <w:r>
+        <w:lastRenderedPageBreak/>
         <w:t xml:space="preserve">8. Tổng quan, thông báo và đồng bộ HanoiCheck</w:t>
       </w:r>
     </w:p>
@@ -2877,7 +2776,6 @@
       </w:r>
     </w:p>
     <w:p>
-      <w:pPr/>
       <w:r>
         <w:t xml:space="preserve">Màn </w:t>
       </w:r>
@@ -2904,7 +2802,7 @@
         <w:tblStyle w:val="TableGrid"/>
         <w:tblW w:w="0" w:type="auto"/>
         <w:tblLayout w:type="fixed"/>
-        <w:tblLook w:val="04A0" w:firstRow="1" w:lastRow="0" w:firstColumn="0" w:lastColumn="0" w:noHBand="0" w:noVBand="1"/>
+        <w:tblLook w:val="0420" w:firstRow="1" w:lastRow="0" w:firstColumn="0" w:lastColumn="0" w:noHBand="0" w:noVBand="1"/>
       </w:tblPr>
       <w:tblGrid>
         <w:gridCol w:w="4680"/>
@@ -2920,7 +2818,6 @@
             <w:shd w:val="clear" w:color="auto" w:fill="F2F2F2"/>
           </w:tcPr>
           <w:p>
-            <w:pPr/>
             <w:r>
               <w:t xml:space="preserve">Khi nào</w:t>
             </w:r>
@@ -2932,7 +2829,6 @@
             <w:shd w:val="clear" w:color="auto" w:fill="F2F2F2"/>
           </w:tcPr>
           <w:p>
-            <w:pPr/>
             <w:r>
               <w:t xml:space="preserve">Ai nhận</w:t>
             </w:r>
@@ -2945,7 +2841,6 @@
             <w:tcW w:w="4680" w:type="dxa"/>
           </w:tcPr>
           <w:p>
-            <w:pPr/>
             <w:r>
               <w:t xml:space="preserve">Có đơn hàng mới (tạo tay hoặc từ trường)</w:t>
             </w:r>
@@ -2956,7 +2851,6 @@
             <w:tcW w:w="4680" w:type="dxa"/>
           </w:tcPr>
           <w:p>
-            <w:pPr/>
             <w:r>
               <w:t xml:space="preserve">Chủ cơ sở, nhập liệu</w:t>
             </w:r>
@@ -2969,7 +2863,6 @@
             <w:tcW w:w="4680" w:type="dxa"/>
           </w:tcPr>
           <w:p>
-            <w:pPr/>
             <w:r>
               <w:t xml:space="preserve">Đơn đã xác nhận</w:t>
             </w:r>
@@ -2980,7 +2873,6 @@
             <w:tcW w:w="4680" w:type="dxa"/>
           </w:tcPr>
           <w:p>
-            <w:pPr/>
             <w:r>
               <w:t xml:space="preserve">Chủ cơ sở, nhập liệu</w:t>
             </w:r>
@@ -2993,7 +2885,6 @@
             <w:tcW w:w="4680" w:type="dxa"/>
           </w:tcPr>
           <w:p>
-            <w:pPr/>
             <w:r>
               <w:t xml:space="preserve">Đơn đã xuất kho, chờ giao / được giao cho mình</w:t>
             </w:r>
@@ -3004,7 +2895,6 @@
             <w:tcW w:w="4680" w:type="dxa"/>
           </w:tcPr>
           <w:p>
-            <w:pPr/>
             <w:r>
               <w:t xml:space="preserve">Chủ cơ sở, nhập liệu, giao hàng</w:t>
             </w:r>
@@ -3017,7 +2907,6 @@
             <w:tcW w:w="4680" w:type="dxa"/>
           </w:tcPr>
           <w:p>
-            <w:pPr/>
             <w:r>
               <w:t xml:space="preserve">Đơn đã giao xong</w:t>
             </w:r>
@@ -3028,7 +2917,6 @@
             <w:tcW w:w="4680" w:type="dxa"/>
           </w:tcPr>
           <w:p>
-            <w:pPr/>
             <w:r>
               <w:t xml:space="preserve">Chủ cơ sở, nhập liệu</w:t>
             </w:r>
@@ -3041,7 +2929,6 @@
             <w:tcW w:w="4680" w:type="dxa"/>
           </w:tcPr>
           <w:p>
-            <w:pPr/>
             <w:r>
               <w:t xml:space="preserve">Lệnh sản xuất mới</w:t>
             </w:r>
@@ -3052,7 +2939,6 @@
             <w:tcW w:w="4680" w:type="dxa"/>
           </w:tcPr>
           <w:p>
-            <w:pPr/>
             <w:r>
               <w:t xml:space="preserve">Chủ cơ sở, nhập liệu, sản xuất</w:t>
             </w:r>
@@ -3065,7 +2951,6 @@
             <w:tcW w:w="4680" w:type="dxa"/>
           </w:tcPr>
           <w:p>
-            <w:pPr/>
             <w:r>
               <w:t xml:space="preserve">Lệnh sản xuất hoàn thành</w:t>
             </w:r>
@@ -3076,7 +2961,6 @@
             <w:tcW w:w="4680" w:type="dxa"/>
           </w:tcPr>
           <w:p>
-            <w:pPr/>
             <w:r>
               <w:t xml:space="preserve">Chủ cơ sở, nhập liệu, sản xuất</w:t>
             </w:r>
@@ -3085,7 +2969,6 @@
       </w:tr>
     </w:tbl>
     <w:p>
-      <w:pPr/>
       <w:r>
         <w:t xml:space="preserve">Không nhận được thì kiểm tra đã cho phép app gửi thông báo và đã đăng nhập trên máy đó.</w:t>
       </w:r>
@@ -3134,7 +3017,7 @@
         <w:t xml:space="preserve">Gửi lại</w:t>
       </w:r>
       <w:r>
-        <w:t xml:space="preserve">.</w:t>
+        <w:t>.</w:t>
       </w:r>
     </w:p>
     <w:p>
@@ -3180,7 +3063,7 @@
         <w:tblStyle w:val="TableGrid"/>
         <w:tblW w:w="0" w:type="auto"/>
         <w:tblLayout w:type="fixed"/>
-        <w:tblLook w:val="04A0" w:firstRow="1" w:lastRow="0" w:firstColumn="0" w:lastColumn="0" w:noHBand="0" w:noVBand="1"/>
+        <w:tblLook w:val="0420" w:firstRow="1" w:lastRow="0" w:firstColumn="0" w:lastColumn="0" w:noHBand="0" w:noVBand="1"/>
       </w:tblPr>
       <w:tblGrid>
         <w:gridCol w:w="4680"/>
@@ -3196,7 +3079,6 @@
             <w:shd w:val="clear" w:color="auto" w:fill="F2F2F2"/>
           </w:tcPr>
           <w:p>
-            <w:pPr/>
             <w:r>
               <w:t xml:space="preserve">Tình huống</w:t>
             </w:r>
@@ -3208,7 +3090,6 @@
             <w:shd w:val="clear" w:color="auto" w:fill="F2F2F2"/>
           </w:tcPr>
           <w:p>
-            <w:pPr/>
             <w:r>
               <w:t xml:space="preserve">Cách xử lý</w:t>
             </w:r>
@@ -3221,7 +3102,6 @@
             <w:tcW w:w="4680" w:type="dxa"/>
           </w:tcPr>
           <w:p>
-            <w:pPr/>
             <w:r>
               <w:t xml:space="preserve">Nhân viên không đăng nhập được</w:t>
             </w:r>
@@ -3232,7 +3112,6 @@
             <w:tcW w:w="4680" w:type="dxa"/>
           </w:tcPr>
           <w:p>
-            <w:pPr/>
             <w:r>
               <w:t xml:space="preserve">Chủ cơ sở kiểm tra hồ sơ còn "Đang làm việc", đã bật "Cho phép đăng nhập", đặt lại mật khẩu; nhân viên dùng đúng số điện thoại</w:t>
             </w:r>
@@ -3245,7 +3124,6 @@
             <w:tcW w:w="4680" w:type="dxa"/>
           </w:tcPr>
           <w:p>
-            <w:pPr/>
             <w:r>
               <w:t xml:space="preserve">App không hiện tab cần dùng</w:t>
             </w:r>
@@ -3256,7 +3134,6 @@
             <w:tcW w:w="4680" w:type="dxa"/>
           </w:tcPr>
           <w:p>
-            <w:pPr/>
             <w:r>
               <w:t xml:space="preserve">Tài khoản chưa có vai trò đó – Chủ cơ sở tick thêm ở màn Nhân sự</w:t>
             </w:r>
@@ -3269,7 +3146,6 @@
             <w:tcW w:w="4680" w:type="dxa"/>
           </w:tcPr>
           <w:p>
-            <w:pPr/>
             <w:r>
               <w:t xml:space="preserve">Nhân viên không thấy một biểu mẫu</w:t>
             </w:r>
@@ -3280,7 +3156,6 @@
             <w:tcW w:w="4680" w:type="dxa"/>
           </w:tcPr>
           <w:p>
-            <w:pPr/>
             <w:r>
               <w:t xml:space="preserve">Chưa được giao mẫu đó, hoặc mẫu đang tắt Kích hoạt</w:t>
             </w:r>
@@ -3293,7 +3168,6 @@
             <w:tcW w:w="4680" w:type="dxa"/>
           </w:tcPr>
           <w:p>
-            <w:pPr/>
             <w:r>
               <w:t xml:space="preserve">Không lập được lệnh cho một thành phẩm</w:t>
             </w:r>
@@ -3304,9 +3178,10 @@
             <w:tcW w:w="4680" w:type="dxa"/>
           </w:tcPr>
           <w:p>
-            <w:pPr/>
-            <w:r>
-              <w:t xml:space="preserve">Thành phẩm chưa có Định mức, hoặc quy trình chưa đủ khâu</w:t>
+            <w:r>
+              <w:t xml:space="preserve">Thành phẩm chưa có Định mức, hoặc quy trình </w:t>
+              <w:lastRenderedPageBreak/>
+              <w:t xml:space="preserve">chưa đủ khâu</w:t>
             </w:r>
           </w:p>
         </w:tc>
@@ -3317,8 +3192,8 @@
             <w:tcW w:w="4680" w:type="dxa"/>
           </w:tcPr>
           <w:p>
-            <w:pPr/>
-            <w:r>
+            <w:r>
+              <w:lastRenderedPageBreak/>
               <w:t xml:space="preserve">Hoàn thành lệnh báo thiếu người thực hiện</w:t>
             </w:r>
           </w:p>
@@ -3328,7 +3203,6 @@
             <w:tcW w:w="4680" w:type="dxa"/>
           </w:tcPr>
           <w:p>
-            <w:pPr/>
             <w:r>
               <w:t xml:space="preserve">Mỗi khâu cần ít nhất 1 người: nhân viên Tham gia trên app, hoặc chọn người lúc hoàn thành</w:t>
             </w:r>
@@ -3341,7 +3215,6 @@
             <w:tcW w:w="4680" w:type="dxa"/>
           </w:tcPr>
           <w:p>
-            <w:pPr/>
             <w:r>
               <w:t xml:space="preserve">Không đủ nguyên liệu / không xuất kho được đơn</w:t>
             </w:r>
@@ -3352,7 +3225,6 @@
             <w:tcW w:w="4680" w:type="dxa"/>
           </w:tcPr>
           <w:p>
-            <w:pPr/>
             <w:r>
               <w:t xml:space="preserve">Kiểm tra tồn theo lô; nhập thêm, sản xuất bổ sung hoặc chọn kho khác</w:t>
             </w:r>
@@ -3365,7 +3237,6 @@
             <w:tcW w:w="4680" w:type="dxa"/>
           </w:tcPr>
           <w:p>
-            <w:pPr/>
             <w:r>
               <w:t xml:space="preserve">Tồn trên phần mềm lệch thực tế</w:t>
             </w:r>
@@ -3376,7 +3247,6 @@
             <w:tcW w:w="4680" w:type="dxa"/>
           </w:tcPr>
           <w:p>
-            <w:pPr/>
             <w:r>
               <w:t xml:space="preserve">Kiểm kê / Điều chỉnh lô đó (mục 5.1)</w:t>
             </w:r>
@@ -3389,7 +3259,6 @@
             <w:tcW w:w="4680" w:type="dxa"/>
           </w:tcPr>
           <w:p>
-            <w:pPr/>
             <w:r>
               <w:t xml:space="preserve">Đơn trường lệch trạng thái với HanoiCheck</w:t>
             </w:r>
@@ -3400,7 +3269,6 @@
             <w:tcW w:w="4680" w:type="dxa"/>
           </w:tcPr>
           <w:p>
-            <w:pPr/>
             <w:r>
               <w:t xml:space="preserve">Thường do đã xử lý thẳng trên cổng HanoiCheck; báo quản trị hệ thống chỉnh cho khớp</w:t>
             </w:r>
@@ -3413,7 +3281,6 @@
             <w:tcW w:w="4680" w:type="dxa"/>
           </w:tcPr>
           <w:p>
-            <w:pPr/>
             <w:r>
               <w:t xml:space="preserve">Bản ghi không sang HanoiCheck</w:t>
             </w:r>
@@ -3424,7 +3291,6 @@
             <w:tcW w:w="4680" w:type="dxa"/>
           </w:tcPr>
           <w:p>
-            <w:pPr/>
             <w:r>
               <w:t xml:space="preserve">Xem Nhật ký đồng bộ: lỗi gì, bấm Gửi lại; kiểm tra công tắc tổng và ô Đồng bộ HanoiCheck của bản ghi</w:t>
             </w:r>
@@ -3437,7 +3303,6 @@
             <w:tcW w:w="4680" w:type="dxa"/>
           </w:tcPr>
           <w:p>
-            <w:pPr/>
             <w:r>
               <w:t xml:space="preserve">Lưu phiếu báo "vừa được người khác cập nhật"</w:t>
             </w:r>
@@ -3448,7 +3313,6 @@
             <w:tcW w:w="4680" w:type="dxa"/>
           </w:tcPr>
           <w:p>
-            <w:pPr/>
             <w:r>
               <w:t xml:space="preserve">Bấm Tải lại rồi nhập tiếp – tránh ghi đè phần người khác vừa nhập</w:t>
             </w:r>
@@ -3461,7 +3325,6 @@
             <w:tcW w:w="4680" w:type="dxa"/>
           </w:tcPr>
           <w:p>
-            <w:pPr/>
             <w:r>
               <w:t xml:space="preserve">Quét QR phiếu báo đỏ "Dữ liệu đã bị thay đổi"</w:t>
             </w:r>
@@ -3472,7 +3335,6 @@
             <w:tcW w:w="4680" w:type="dxa"/>
           </w:tcPr>
           <w:p>
-            <w:pPr/>
             <w:r>
               <w:t xml:space="preserve">Dữ liệu bị sửa ngoài phần mềm sau khi ký – báo ngay quản trị để kiểm tra</w:t>
             </w:r>
@@ -3481,24 +3343,271 @@
       </w:tr>
     </w:tbl>
     <w:p>
-      <w:pPr/>
       <w:r>
         <w:t xml:space="preserve">Các quy ước chung: mọi thời điểm hiển thị theo giờ Việt Nam; ngày dạng dd/MM/yyyy, giờ 24h; mã tự sinh đánh số lại theo ngày (LSX-, DH-, LO-yyyyMMdd-001) và không sửa được sau khi cấp.</w:t>
       </w:r>
     </w:p>
     <w:sectPr>
+      <w:headerReference w:type="even" r:id="rId7"/>
+      <w:headerReference w:type="default" r:id="rId8"/>
+      <w:footerReference w:type="even" r:id="rId9"/>
+      <w:footerReference w:type="default" r:id="rId10"/>
+      <w:headerReference w:type="first" r:id="rId11"/>
+      <w:footerReference w:type="first" r:id="rId12"/>
       <w:pgSz w:w="12240" w:h="15840"/>
       <w:pgMar w:top="1440" w:right="1440" w:bottom="1440" w:left="1440" w:header="720" w:footer="720" w:gutter="0"/>
+      <w:cols w:space="720"/>
     </w:sectPr>
   </w:body>
 </w:document>
 </file>
 
+<file path=word/endnotes.xml><?xml version="1.0" encoding="utf-8"?>
+<w:endnotes xmlns:wpc="http://schemas.microsoft.com/office/word/2010/wordprocessingCanvas" xmlns:cx="http://schemas.microsoft.com/office/drawing/2014/chartex" xmlns:cx1="http://schemas.microsoft.com/office/drawing/2015/9/8/chartex" xmlns:cx2="http://schemas.microsoft.com/office/drawing/2015/10/21/chartex" xmlns:cx3="http://schemas.microsoft.com/office/drawing/2016/5/9/chartex" xmlns:cx4="http://schemas.microsoft.com/office/drawing/2016/5/10/chartex" xmlns:cx5="http://schemas.microsoft.com/office/drawing/2016/5/11/chartex" xmlns:cx6="http://schemas.microsoft.com/office/drawing/2016/5/12/chartex" xmlns:cx7="http://schemas.microsoft.com/office/drawing/2016/5/13/chartex" xmlns:cx8="http://schemas.microsoft.com/office/drawing/2016/5/14/chartex" xmlns:mc="http://schemas.openxmlformats.org/markup-compatibility/2006" xmlns:aink="http://schemas.microsoft.com/office/drawing/2016/ink" xmlns:am3d="http://schemas.microsoft.com/office/drawing/2017/model3d" xmlns:o="urn:schemas-microsoft-com:office:office" xmlns:oel="http://schemas.microsoft.com/office/2019/extlst" xmlns:r="http://schemas.openxmlformats.org/officeDocument/2006/relationships" xmlns:m="http://schemas.openxmlformats.org/officeDocument/2006/math" xmlns:v="urn:schemas-microsoft-com:vml" xmlns:wp14="http://schemas.microsoft.com/office/word/2010/wordprocessingDrawing" xmlns:wp="http://schemas.openxmlformats.org/drawingml/2006/wordprocessingDrawing" xmlns:w10="urn:schemas-microsoft-com:office:word" xmlns:w="http://schemas.openxmlformats.org/wordprocessingml/2006/main" xmlns:w14="http://schemas.microsoft.com/office/word/2010/wordml" xmlns:w15="http://schemas.microsoft.com/office/word/2012/wordml" xmlns:w16cex="http://schemas.microsoft.com/office/word/2018/wordml/cex" xmlns:w16cid="http://schemas.microsoft.com/office/word/2016/wordml/cid" xmlns:w16="http://schemas.microsoft.com/office/word/2018/wordml" xmlns:w16du="http://schemas.microsoft.com/office/word/2023/wordml/word16du" xmlns:w16sdtdh="http://schemas.microsoft.com/office/word/2020/wordml/sdtdatahash" xmlns:w16sdtfl="http://schemas.microsoft.com/office/word/2024/wordml/sdtformatlock" xmlns:w16se="http://schemas.microsoft.com/office/word/2015/wordml/symex" xmlns:wpg="http://schemas.microsoft.com/office/word/2010/wordprocessingGroup" xmlns:wpi="http://schemas.microsoft.com/office/word/2010/wordprocessingInk" xmlns:wne="http://schemas.microsoft.com/office/word/2006/wordml" xmlns:wps="http://schemas.microsoft.com/office/word/2010/wordprocessingShape" mc:Ignorable="w14 w15 w16se w16cid w16 w16cex w16sdtdh w16sdtfl w16du wp14">
+  <w:endnote w:type="separator" w:id="-1">
+    <w:p>
+      <w:pPr>
+        <w:spacing w:after="0" w:line="240" w:lineRule="auto"/>
+      </w:pPr>
+      <w:r>
+        <w:separator/>
+      </w:r>
+    </w:p>
+  </w:endnote>
+  <w:endnote w:type="continuationSeparator" w:id="0">
+    <w:p>
+      <w:pPr>
+        <w:spacing w:after="0" w:line="240" w:lineRule="auto"/>
+      </w:pPr>
+      <w:r>
+        <w:continuationSeparator/>
+      </w:r>
+    </w:p>
+  </w:endnote>
+</w:endnotes>
+</file>
+
+<file path=word/footer1.xml><?xml version="1.0" encoding="utf-8"?>
+<w:ftr xmlns:wpc="http://schemas.microsoft.com/office/word/2010/wordprocessingCanvas" xmlns:cx="http://schemas.microsoft.com/office/drawing/2014/chartex" xmlns:cx1="http://schemas.microsoft.com/office/drawing/2015/9/8/chartex" xmlns:cx2="http://schemas.microsoft.com/office/drawing/2015/10/21/chartex" xmlns:cx3="http://schemas.microsoft.com/office/drawing/2016/5/9/chartex" xmlns:cx4="http://schemas.microsoft.com/office/drawing/2016/5/10/chartex" xmlns:cx5="http://schemas.microsoft.com/office/drawing/2016/5/11/chartex" xmlns:cx6="http://schemas.microsoft.com/office/drawing/2016/5/12/chartex" xmlns:cx7="http://schemas.microsoft.com/office/drawing/2016/5/13/chartex" xmlns:cx8="http://schemas.microsoft.com/office/drawing/2016/5/14/chartex" xmlns:mc="http://schemas.openxmlformats.org/markup-compatibility/2006" xmlns:aink="http://schemas.microsoft.com/office/drawing/2016/ink" xmlns:am3d="http://schemas.microsoft.com/office/drawing/2017/model3d" xmlns:o="urn:schemas-microsoft-com:office:office" xmlns:oel="http://schemas.microsoft.com/office/2019/extlst" xmlns:r="http://schemas.openxmlformats.org/officeDocument/2006/relationships" xmlns:m="http://schemas.openxmlformats.org/officeDocument/2006/math" xmlns:v="urn:schemas-microsoft-com:vml" xmlns:wp14="http://schemas.microsoft.com/office/word/2010/wordprocessingDrawing" xmlns:wp="http://schemas.openxmlformats.org/drawingml/2006/wordprocessingDrawing" xmlns:w10="urn:schemas-microsoft-com:office:word" xmlns:w="http://schemas.openxmlformats.org/wordprocessingml/2006/main" xmlns:w14="http://schemas.microsoft.com/office/word/2010/wordml" xmlns:w15="http://schemas.microsoft.com/office/word/2012/wordml" xmlns:w16cex="http://schemas.microsoft.com/office/word/2018/wordml/cex" xmlns:w16cid="http://schemas.microsoft.com/office/word/2016/wordml/cid" xmlns:w16="http://schemas.microsoft.com/office/word/2018/wordml" xmlns:w16du="http://schemas.microsoft.com/office/word/2023/wordml/word16du" xmlns:w16sdtdh="http://schemas.microsoft.com/office/word/2020/wordml/sdtdatahash" xmlns:w16sdtfl="http://schemas.microsoft.com/office/word/2024/wordml/sdtformatlock" xmlns:w16se="http://schemas.microsoft.com/office/word/2015/wordml/symex" xmlns:wpg="http://schemas.microsoft.com/office/word/2010/wordprocessingGroup" xmlns:wpi="http://schemas.microsoft.com/office/word/2010/wordprocessingInk" xmlns:wne="http://schemas.microsoft.com/office/word/2006/wordml" xmlns:wps="http://schemas.microsoft.com/office/word/2010/wordprocessingShape" mc:Ignorable="w14 w15 w16se w16cid w16 w16cex w16sdtdh w16sdtfl w16du wp14">
+  <w:p>
+    <w:pPr>
+      <w:pStyle w:val="Footer"/>
+    </w:pPr>
+  </w:p>
+</w:ftr>
+</file>
+
+<file path=word/footer2.xml><?xml version="1.0" encoding="utf-8"?>
+<w:ftr xmlns:wpc="http://schemas.microsoft.com/office/word/2010/wordprocessingCanvas" xmlns:cx="http://schemas.microsoft.com/office/drawing/2014/chartex" xmlns:cx1="http://schemas.microsoft.com/office/drawing/2015/9/8/chartex" xmlns:cx2="http://schemas.microsoft.com/office/drawing/2015/10/21/chartex" xmlns:cx3="http://schemas.microsoft.com/office/drawing/2016/5/9/chartex" xmlns:cx4="http://schemas.microsoft.com/office/drawing/2016/5/10/chartex" xmlns:cx5="http://schemas.microsoft.com/office/drawing/2016/5/11/chartex" xmlns:cx6="http://schemas.microsoft.com/office/drawing/2016/5/12/chartex" xmlns:cx7="http://schemas.microsoft.com/office/drawing/2016/5/13/chartex" xmlns:cx8="http://schemas.microsoft.com/office/drawing/2016/5/14/chartex" xmlns:mc="http://schemas.openxmlformats.org/markup-compatibility/2006" xmlns:aink="http://schemas.microsoft.com/office/drawing/2016/ink" xmlns:am3d="http://schemas.microsoft.com/office/drawing/2017/model3d" xmlns:o="urn:schemas-microsoft-com:office:office" xmlns:oel="http://schemas.microsoft.com/office/2019/extlst" xmlns:r="http://schemas.openxmlformats.org/officeDocument/2006/relationships" xmlns:m="http://schemas.openxmlformats.org/officeDocument/2006/math" xmlns:v="urn:schemas-microsoft-com:vml" xmlns:wp14="http://schemas.microsoft.com/office/word/2010/wordprocessingDrawing" xmlns:wp="http://schemas.openxmlformats.org/drawingml/2006/wordprocessingDrawing" xmlns:w10="urn:schemas-microsoft-com:office:word" xmlns:w="http://schemas.openxmlformats.org/wordprocessingml/2006/main" xmlns:w14="http://schemas.microsoft.com/office/word/2010/wordml" xmlns:w15="http://schemas.microsoft.com/office/word/2012/wordml" xmlns:w16cex="http://schemas.microsoft.com/office/word/2018/wordml/cex" xmlns:w16cid="http://schemas.microsoft.com/office/word/2016/wordml/cid" xmlns:w16="http://schemas.microsoft.com/office/word/2018/wordml" xmlns:w16du="http://schemas.microsoft.com/office/word/2023/wordml/word16du" xmlns:w16sdtdh="http://schemas.microsoft.com/office/word/2020/wordml/sdtdatahash" xmlns:w16sdtfl="http://schemas.microsoft.com/office/word/2024/wordml/sdtformatlock" xmlns:w16se="http://schemas.microsoft.com/office/word/2015/wordml/symex" xmlns:wpg="http://schemas.microsoft.com/office/word/2010/wordprocessingGroup" xmlns:wpi="http://schemas.microsoft.com/office/word/2010/wordprocessingInk" xmlns:wne="http://schemas.microsoft.com/office/word/2006/wordml" xmlns:wps="http://schemas.microsoft.com/office/word/2010/wordprocessingShape" mc:Ignorable="w14 w15 w16se w16cid w16 w16cex w16sdtdh w16sdtfl w16du wp14">
+  <w:sdt>
+    <w:sdtPr>
+      <w:id w:val="71162425"/>
+      <w:docPartObj>
+        <w:docPartGallery w:val="Page Numbers (Bottom of Page)"/>
+        <w:docPartUnique/>
+      </w:docPartObj>
+    </w:sdtPr>
+    <w:sdtEndPr>
+      <w:rPr>
+        <w:noProof/>
+      </w:rPr>
+    </w:sdtEndPr>
+    <w:sdtContent>
+      <w:p>
+        <w:pPr>
+          <w:pStyle w:val="Footer"/>
+          <w:jc w:val="center"/>
+        </w:pPr>
+        <w:r>
+          <w:fldChar w:fldCharType="begin"/>
+        </w:r>
+        <w:r>
+          <w:instrText xml:space="preserve"> PAGE   \* MERGEFORMAT </w:instrText>
+        </w:r>
+        <w:r>
+          <w:fldChar w:fldCharType="separate"/>
+        </w:r>
+        <w:r>
+          <w:rPr>
+            <w:noProof/>
+          </w:rPr>
+          <w:t>2</w:t>
+        </w:r>
+        <w:r>
+          <w:rPr>
+            <w:noProof/>
+          </w:rPr>
+          <w:fldChar w:fldCharType="end"/>
+        </w:r>
+      </w:p>
+    </w:sdtContent>
+  </w:sdt>
+  <w:p>
+    <w:pPr>
+      <w:pStyle w:val="Footer"/>
+    </w:pPr>
+  </w:p>
+</w:ftr>
+</file>
+
+<file path=word/footer3.xml><?xml version="1.0" encoding="utf-8"?>
+<w:ftr xmlns:wpc="http://schemas.microsoft.com/office/word/2010/wordprocessingCanvas" xmlns:cx="http://schemas.microsoft.com/office/drawing/2014/chartex" xmlns:cx1="http://schemas.microsoft.com/office/drawing/2015/9/8/chartex" xmlns:cx2="http://schemas.microsoft.com/office/drawing/2015/10/21/chartex" xmlns:cx3="http://schemas.microsoft.com/office/drawing/2016/5/9/chartex" xmlns:cx4="http://schemas.microsoft.com/office/drawing/2016/5/10/chartex" xmlns:cx5="http://schemas.microsoft.com/office/drawing/2016/5/11/chartex" xmlns:cx6="http://schemas.microsoft.com/office/drawing/2016/5/12/chartex" xmlns:cx7="http://schemas.microsoft.com/office/drawing/2016/5/13/chartex" xmlns:cx8="http://schemas.microsoft.com/office/drawing/2016/5/14/chartex" xmlns:mc="http://schemas.openxmlformats.org/markup-compatibility/2006" xmlns:aink="http://schemas.microsoft.com/office/drawing/2016/ink" xmlns:am3d="http://schemas.microsoft.com/office/drawing/2017/model3d" xmlns:o="urn:schemas-microsoft-com:office:office" xmlns:oel="http://schemas.microsoft.com/office/2019/extlst" xmlns:r="http://schemas.openxmlformats.org/officeDocument/2006/relationships" xmlns:m="http://schemas.openxmlformats.org/officeDocument/2006/math" xmlns:v="urn:schemas-microsoft-com:vml" xmlns:wp14="http://schemas.microsoft.com/office/word/2010/wordprocessingDrawing" xmlns:wp="http://schemas.openxmlformats.org/drawingml/2006/wordprocessingDrawing" xmlns:w10="urn:schemas-microsoft-com:office:word" xmlns:w="http://schemas.openxmlformats.org/wordprocessingml/2006/main" xmlns:w14="http://schemas.microsoft.com/office/word/2010/wordml" xmlns:w15="http://schemas.microsoft.com/office/word/2012/wordml" xmlns:w16cex="http://schemas.microsoft.com/office/word/2018/wordml/cex" xmlns:w16cid="http://schemas.microsoft.com/office/word/2016/wordml/cid" xmlns:w16="http://schemas.microsoft.com/office/word/2018/wordml" xmlns:w16du="http://schemas.microsoft.com/office/word/2023/wordml/word16du" xmlns:w16sdtdh="http://schemas.microsoft.com/office/word/2020/wordml/sdtdatahash" xmlns:w16sdtfl="http://schemas.microsoft.com/office/word/2024/wordml/sdtformatlock" xmlns:w16se="http://schemas.microsoft.com/office/word/2015/wordml/symex" xmlns:wpg="http://schemas.microsoft.com/office/word/2010/wordprocessingGroup" xmlns:wpi="http://schemas.microsoft.com/office/word/2010/wordprocessingInk" xmlns:wne="http://schemas.microsoft.com/office/word/2006/wordml" xmlns:wps="http://schemas.microsoft.com/office/word/2010/wordprocessingShape" mc:Ignorable="w14 w15 w16se w16cid w16 w16cex w16sdtdh w16sdtfl w16du wp14">
+  <w:p>
+    <w:pPr>
+      <w:pStyle w:val="Footer"/>
+    </w:pPr>
+  </w:p>
+</w:ftr>
+</file>
+
+<file path=word/footnotes.xml><?xml version="1.0" encoding="utf-8"?>
+<w:footnotes xmlns:wpc="http://schemas.microsoft.com/office/word/2010/wordprocessingCanvas" xmlns:cx="http://schemas.microsoft.com/office/drawing/2014/chartex" xmlns:cx1="http://schemas.microsoft.com/office/drawing/2015/9/8/chartex" xmlns:cx2="http://schemas.microsoft.com/office/drawing/2015/10/21/chartex" xmlns:cx3="http://schemas.microsoft.com/office/drawing/2016/5/9/chartex" xmlns:cx4="http://schemas.microsoft.com/office/drawing/2016/5/10/chartex" xmlns:cx5="http://schemas.microsoft.com/office/drawing/2016/5/11/chartex" xmlns:cx6="http://schemas.microsoft.com/office/drawing/2016/5/12/chartex" xmlns:cx7="http://schemas.microsoft.com/office/drawing/2016/5/13/chartex" xmlns:cx8="http://schemas.microsoft.com/office/drawing/2016/5/14/chartex" xmlns:mc="http://schemas.openxmlformats.org/markup-compatibility/2006" xmlns:aink="http://schemas.microsoft.com/office/drawing/2016/ink" xmlns:am3d="http://schemas.microsoft.com/office/drawing/2017/model3d" xmlns:o="urn:schemas-microsoft-com:office:office" xmlns:oel="http://schemas.microsoft.com/office/2019/extlst" xmlns:r="http://schemas.openxmlformats.org/officeDocument/2006/relationships" xmlns:m="http://schemas.openxmlformats.org/officeDocument/2006/math" xmlns:v="urn:schemas-microsoft-com:vml" xmlns:wp14="http://schemas.microsoft.com/office/word/2010/wordprocessingDrawing" xmlns:wp="http://schemas.openxmlformats.org/drawingml/2006/wordprocessingDrawing" xmlns:w10="urn:schemas-microsoft-com:office:word" xmlns:w="http://schemas.openxmlformats.org/wordprocessingml/2006/main" xmlns:w14="http://schemas.microsoft.com/office/word/2010/wordml" xmlns:w15="http://schemas.microsoft.com/office/word/2012/wordml" xmlns:w16cex="http://schemas.microsoft.com/office/word/2018/wordml/cex" xmlns:w16cid="http://schemas.microsoft.com/office/word/2016/wordml/cid" xmlns:w16="http://schemas.microsoft.com/office/word/2018/wordml" xmlns:w16du="http://schemas.microsoft.com/office/word/2023/wordml/word16du" xmlns:w16sdtdh="http://schemas.microsoft.com/office/word/2020/wordml/sdtdatahash" xmlns:w16sdtfl="http://schemas.microsoft.com/office/word/2024/wordml/sdtformatlock" xmlns:w16se="http://schemas.microsoft.com/office/word/2015/wordml/symex" xmlns:wpg="http://schemas.microsoft.com/office/word/2010/wordprocessingGroup" xmlns:wpi="http://schemas.microsoft.com/office/word/2010/wordprocessingInk" xmlns:wne="http://schemas.microsoft.com/office/word/2006/wordml" xmlns:wps="http://schemas.microsoft.com/office/word/2010/wordprocessingShape" mc:Ignorable="w14 w15 w16se w16cid w16 w16cex w16sdtdh w16sdtfl w16du wp14">
+  <w:footnote w:type="separator" w:id="-1">
+    <w:p>
+      <w:pPr>
+        <w:spacing w:after="0" w:line="240" w:lineRule="auto"/>
+      </w:pPr>
+      <w:r>
+        <w:separator/>
+      </w:r>
+    </w:p>
+  </w:footnote>
+  <w:footnote w:type="continuationSeparator" w:id="0">
+    <w:p>
+      <w:pPr>
+        <w:spacing w:after="0" w:line="240" w:lineRule="auto"/>
+      </w:pPr>
+      <w:r>
+        <w:continuationSeparator/>
+      </w:r>
+    </w:p>
+  </w:footnote>
+</w:footnotes>
+</file>
+
+<file path=word/header1.xml><?xml version="1.0" encoding="utf-8"?>
+<w:hdr xmlns:wpc="http://schemas.microsoft.com/office/word/2010/wordprocessingCanvas" xmlns:cx="http://schemas.microsoft.com/office/drawing/2014/chartex" xmlns:cx1="http://schemas.microsoft.com/office/drawing/2015/9/8/chartex" xmlns:cx2="http://schemas.microsoft.com/office/drawing/2015/10/21/chartex" xmlns:cx3="http://schemas.microsoft.com/office/drawing/2016/5/9/chartex" xmlns:cx4="http://schemas.microsoft.com/office/drawing/2016/5/10/chartex" xmlns:cx5="http://schemas.microsoft.com/office/drawing/2016/5/11/chartex" xmlns:cx6="http://schemas.microsoft.com/office/drawing/2016/5/12/chartex" xmlns:cx7="http://schemas.microsoft.com/office/drawing/2016/5/13/chartex" xmlns:cx8="http://schemas.microsoft.com/office/drawing/2016/5/14/chartex" xmlns:mc="http://schemas.openxmlformats.org/markup-compatibility/2006" xmlns:aink="http://schemas.microsoft.com/office/drawing/2016/ink" xmlns:am3d="http://schemas.microsoft.com/office/drawing/2017/model3d" xmlns:o="urn:schemas-microsoft-com:office:office" xmlns:oel="http://schemas.microsoft.com/office/2019/extlst" xmlns:r="http://schemas.openxmlformats.org/officeDocument/2006/relationships" xmlns:m="http://schemas.openxmlformats.org/officeDocument/2006/math" xmlns:v="urn:schemas-microsoft-com:vml" xmlns:wp14="http://schemas.microsoft.com/office/word/2010/wordprocessingDrawing" xmlns:wp="http://schemas.openxmlformats.org/drawingml/2006/wordprocessingDrawing" xmlns:w10="urn:schemas-microsoft-com:office:word" xmlns:w="http://schemas.openxmlformats.org/wordprocessingml/2006/main" xmlns:w14="http://schemas.microsoft.com/office/word/2010/wordml" xmlns:w15="http://schemas.microsoft.com/office/word/2012/wordml" xmlns:w16cex="http://schemas.microsoft.com/office/word/2018/wordml/cex" xmlns:w16cid="http://schemas.microsoft.com/office/word/2016/wordml/cid" xmlns:w16="http://schemas.microsoft.com/office/word/2018/wordml" xmlns:w16du="http://schemas.microsoft.com/office/word/2023/wordml/word16du" xmlns:w16sdtdh="http://schemas.microsoft.com/office/word/2020/wordml/sdtdatahash" xmlns:w16sdtfl="http://schemas.microsoft.com/office/word/2024/wordml/sdtformatlock" xmlns:w16se="http://schemas.microsoft.com/office/word/2015/wordml/symex" xmlns:wpg="http://schemas.microsoft.com/office/word/2010/wordprocessingGroup" xmlns:wpi="http://schemas.microsoft.com/office/word/2010/wordprocessingInk" xmlns:wne="http://schemas.microsoft.com/office/word/2006/wordml" xmlns:wps="http://schemas.microsoft.com/office/word/2010/wordprocessingShape" mc:Ignorable="w14 w15 w16se w16cid w16 w16cex w16sdtdh w16sdtfl w16du wp14">
+  <w:p>
+    <w:pPr>
+      <w:pStyle w:val="Header"/>
+    </w:pPr>
+  </w:p>
+</w:hdr>
+</file>
+
+<file path=word/header2.xml><?xml version="1.0" encoding="utf-8"?>
+<w:hdr xmlns:wpc="http://schemas.microsoft.com/office/word/2010/wordprocessingCanvas" xmlns:cx="http://schemas.microsoft.com/office/drawing/2014/chartex" xmlns:cx1="http://schemas.microsoft.com/office/drawing/2015/9/8/chartex" xmlns:cx2="http://schemas.microsoft.com/office/drawing/2015/10/21/chartex" xmlns:cx3="http://schemas.microsoft.com/office/drawing/2016/5/9/chartex" xmlns:cx4="http://schemas.microsoft.com/office/drawing/2016/5/10/chartex" xmlns:cx5="http://schemas.microsoft.com/office/drawing/2016/5/11/chartex" xmlns:cx6="http://schemas.microsoft.com/office/drawing/2016/5/12/chartex" xmlns:cx7="http://schemas.microsoft.com/office/drawing/2016/5/13/chartex" xmlns:cx8="http://schemas.microsoft.com/office/drawing/2016/5/14/chartex" xmlns:mc="http://schemas.openxmlformats.org/markup-compatibility/2006" xmlns:aink="http://schemas.microsoft.com/office/drawing/2016/ink" xmlns:am3d="http://schemas.microsoft.com/office/drawing/2017/model3d" xmlns:o="urn:schemas-microsoft-com:office:office" xmlns:oel="http://schemas.microsoft.com/office/2019/extlst" xmlns:r="http://schemas.openxmlformats.org/officeDocument/2006/relationships" xmlns:m="http://schemas.openxmlformats.org/officeDocument/2006/math" xmlns:v="urn:schemas-microsoft-com:vml" xmlns:wp14="http://schemas.microsoft.com/office/word/2010/wordprocessingDrawing" xmlns:wp="http://schemas.openxmlformats.org/drawingml/2006/wordprocessingDrawing" xmlns:w10="urn:schemas-microsoft-com:office:word" xmlns:w="http://schemas.openxmlformats.org/wordprocessingml/2006/main" xmlns:w14="http://schemas.microsoft.com/office/word/2010/wordml" xmlns:w15="http://schemas.microsoft.com/office/word/2012/wordml" xmlns:w16cex="http://schemas.microsoft.com/office/word/2018/wordml/cex" xmlns:w16cid="http://schemas.microsoft.com/office/word/2016/wordml/cid" xmlns:w16="http://schemas.microsoft.com/office/word/2018/wordml" xmlns:w16du="http://schemas.microsoft.com/office/word/2023/wordml/word16du" xmlns:w16sdtdh="http://schemas.microsoft.com/office/word/2020/wordml/sdtdatahash" xmlns:w16sdtfl="http://schemas.microsoft.com/office/word/2024/wordml/sdtformatlock" xmlns:w16se="http://schemas.microsoft.com/office/word/2015/wordml/symex" xmlns:wpg="http://schemas.microsoft.com/office/word/2010/wordprocessingGroup" xmlns:wpi="http://schemas.microsoft.com/office/word/2010/wordprocessingInk" xmlns:wne="http://schemas.microsoft.com/office/word/2006/wordml" xmlns:wps="http://schemas.microsoft.com/office/word/2010/wordprocessingShape" mc:Ignorable="w14 w15 w16se w16cid w16 w16cex w16sdtdh w16sdtfl w16du wp14">
+  <w:p>
+    <w:pPr>
+      <w:pStyle w:val="Header"/>
+    </w:pPr>
+  </w:p>
+</w:hdr>
+</file>
+
+<file path=word/header3.xml><?xml version="1.0" encoding="utf-8"?>
+<w:hdr xmlns:wpc="http://schemas.microsoft.com/office/word/2010/wordprocessingCanvas" xmlns:cx="http://schemas.microsoft.com/office/drawing/2014/chartex" xmlns:cx1="http://schemas.microsoft.com/office/drawing/2015/9/8/chartex" xmlns:cx2="http://schemas.microsoft.com/office/drawing/2015/10/21/chartex" xmlns:cx3="http://schemas.microsoft.com/office/drawing/2016/5/9/chartex" xmlns:cx4="http://schemas.microsoft.com/office/drawing/2016/5/10/chartex" xmlns:cx5="http://schemas.microsoft.com/office/drawing/2016/5/11/chartex" xmlns:cx6="http://schemas.microsoft.com/office/drawing/2016/5/12/chartex" xmlns:cx7="http://schemas.microsoft.com/office/drawing/2016/5/13/chartex" xmlns:cx8="http://schemas.microsoft.com/office/drawing/2016/5/14/chartex" xmlns:mc="http://schemas.openxmlformats.org/markup-compatibility/2006" xmlns:aink="http://schemas.microsoft.com/office/drawing/2016/ink" xmlns:am3d="http://schemas.microsoft.com/office/drawing/2017/model3d" xmlns:o="urn:schemas-microsoft-com:office:office" xmlns:oel="http://schemas.microsoft.com/office/2019/extlst" xmlns:r="http://schemas.openxmlformats.org/officeDocument/2006/relationships" xmlns:m="http://schemas.openxmlformats.org/officeDocument/2006/math" xmlns:v="urn:schemas-microsoft-com:vml" xmlns:wp14="http://schemas.microsoft.com/office/word/2010/wordprocessingDrawing" xmlns:wp="http://schemas.openxmlformats.org/drawingml/2006/wordprocessingDrawing" xmlns:w10="urn:schemas-microsoft-com:office:word" xmlns:w="http://schemas.openxmlformats.org/wordprocessingml/2006/main" xmlns:w14="http://schemas.microsoft.com/office/word/2010/wordml" xmlns:w15="http://schemas.microsoft.com/office/word/2012/wordml" xmlns:w16cex="http://schemas.microsoft.com/office/word/2018/wordml/cex" xmlns:w16cid="http://schemas.microsoft.com/office/word/2016/wordml/cid" xmlns:w16="http://schemas.microsoft.com/office/word/2018/wordml" xmlns:w16du="http://schemas.microsoft.com/office/word/2023/wordml/word16du" xmlns:w16sdtdh="http://schemas.microsoft.com/office/word/2020/wordml/sdtdatahash" xmlns:w16sdtfl="http://schemas.microsoft.com/office/word/2024/wordml/sdtformatlock" xmlns:w16se="http://schemas.microsoft.com/office/word/2015/wordml/symex" xmlns:wpg="http://schemas.microsoft.com/office/word/2010/wordprocessingGroup" xmlns:wpi="http://schemas.microsoft.com/office/word/2010/wordprocessingInk" xmlns:wne="http://schemas.microsoft.com/office/word/2006/wordml" xmlns:wps="http://schemas.microsoft.com/office/word/2010/wordprocessingShape" mc:Ignorable="w14 w15 w16se w16cid w16 w16cex w16sdtdh w16sdtfl w16du wp14">
+  <w:p>
+    <w:pPr>
+      <w:pStyle w:val="Header"/>
+    </w:pPr>
+  </w:p>
+</w:hdr>
+</file>
+
 <file path=word/numbering.xml><?xml version="1.0" encoding="utf-8"?>
-<w:numbering xmlns:w="http://schemas.openxmlformats.org/wordprocessingml/2006/main">
-  <w:abstractNum w:abstractNumId="0">
+<w:numbering xmlns:wpc="http://schemas.microsoft.com/office/word/2010/wordprocessingCanvas" xmlns:cx="http://schemas.microsoft.com/office/drawing/2014/chartex" xmlns:cx1="http://schemas.microsoft.com/office/drawing/2015/9/8/chartex" xmlns:cx2="http://schemas.microsoft.com/office/drawing/2015/10/21/chartex" xmlns:cx3="http://schemas.microsoft.com/office/drawing/2016/5/9/chartex" xmlns:cx4="http://schemas.microsoft.com/office/drawing/2016/5/10/chartex" xmlns:cx5="http://schemas.microsoft.com/office/drawing/2016/5/11/chartex" xmlns:cx6="http://schemas.microsoft.com/office/drawing/2016/5/12/chartex" xmlns:cx7="http://schemas.microsoft.com/office/drawing/2016/5/13/chartex" xmlns:cx8="http://schemas.microsoft.com/office/drawing/2016/5/14/chartex" xmlns:mc="http://schemas.openxmlformats.org/markup-compatibility/2006" xmlns:aink="http://schemas.microsoft.com/office/drawing/2016/ink" xmlns:am3d="http://schemas.microsoft.com/office/drawing/2017/model3d" xmlns:o="urn:schemas-microsoft-com:office:office" xmlns:oel="http://schemas.microsoft.com/office/2019/extlst" xmlns:r="http://schemas.openxmlformats.org/officeDocument/2006/relationships" xmlns:m="http://schemas.openxmlformats.org/officeDocument/2006/math" xmlns:v="urn:schemas-microsoft-com:vml" xmlns:wp14="http://schemas.microsoft.com/office/word/2010/wordprocessingDrawing" xmlns:wp="http://schemas.openxmlformats.org/drawingml/2006/wordprocessingDrawing" xmlns:w10="urn:schemas-microsoft-com:office:word" xmlns:w="http://schemas.openxmlformats.org/wordprocessingml/2006/main" xmlns:w14="http://schemas.microsoft.com/office/word/2010/wordml" xmlns:w15="http://schemas.microsoft.com/office/word/2012/wordml" xmlns:w16cex="http://schemas.microsoft.com/office/word/2018/wordml/cex" xmlns:w16cid="http://schemas.microsoft.com/office/word/2016/wordml/cid" xmlns:w16="http://schemas.microsoft.com/office/word/2018/wordml" xmlns:w16du="http://schemas.microsoft.com/office/word/2023/wordml/word16du" xmlns:w16sdtdh="http://schemas.microsoft.com/office/word/2020/wordml/sdtdatahash" xmlns:w16sdtfl="http://schemas.microsoft.com/office/word/2024/wordml/sdtformatlock" xmlns:w16se="http://schemas.microsoft.com/office/word/2015/wordml/symex" xmlns:wpg="http://schemas.microsoft.com/office/word/2010/wordprocessingGroup" xmlns:wpi="http://schemas.microsoft.com/office/word/2010/wordprocessingInk" xmlns:wne="http://schemas.microsoft.com/office/word/2006/wordml" xmlns:wps="http://schemas.microsoft.com/office/word/2010/wordprocessingShape" mc:Ignorable="w14 w15 w16se w16cid w16 w16cex w16sdtdh w16sdtfl w16du wp14">
+  <w:abstractNum w:abstractNumId="0" w15:restartNumberingAfterBreak="0">
+    <w:nsid w:val="75464AC0"/>
     <w:multiLevelType w:val="hybridMultilevel"/>
-    <w:lvl w:ilvl="0">
+    <w:tmpl w:val="F18E5D92"/>
+    <w:lvl w:ilvl="0" w:tplc="28A479D0">
+      <w:start w:val="1"/>
+      <w:numFmt w:val="decimal"/>
+      <w:lvlText w:val="%1."/>
+      <w:lvlJc w:val="left"/>
+      <w:pPr>
+        <w:ind w:left="720" w:hanging="360"/>
+      </w:pPr>
+    </w:lvl>
+    <w:lvl w:ilvl="1" w:tplc="A15612A0">
+      <w:start w:val="1"/>
+      <w:numFmt w:val="lowerLetter"/>
+      <w:lvlText w:val="%2."/>
+      <w:lvlJc w:val="left"/>
+      <w:pPr>
+        <w:ind w:left="1440" w:hanging="360"/>
+      </w:pPr>
+    </w:lvl>
+    <w:lvl w:ilvl="2" w:tplc="073CEE9C">
+      <w:start w:val="1"/>
+      <w:numFmt w:val="lowerRoman"/>
+      <w:lvlText w:val="%3."/>
+      <w:lvlJc w:val="left"/>
+      <w:pPr>
+        <w:ind w:left="2160" w:hanging="360"/>
+      </w:pPr>
+    </w:lvl>
+    <w:lvl w:ilvl="3" w:tplc="78748964">
+      <w:start w:val="1"/>
+      <w:numFmt w:val="decimal"/>
+      <w:lvlText w:val="%4."/>
+      <w:lvlJc w:val="left"/>
+      <w:pPr>
+        <w:ind w:left="2880" w:hanging="360"/>
+      </w:pPr>
+    </w:lvl>
+    <w:lvl w:ilvl="4" w:tplc="41665E9C">
+      <w:start w:val="1"/>
+      <w:numFmt w:val="lowerLetter"/>
+      <w:lvlText w:val="%5."/>
+      <w:lvlJc w:val="left"/>
+      <w:pPr>
+        <w:ind w:left="3600" w:hanging="360"/>
+      </w:pPr>
+    </w:lvl>
+    <w:lvl w:ilvl="5" w:tplc="1E24D60C">
+      <w:start w:val="1"/>
+      <w:numFmt w:val="lowerRoman"/>
+      <w:lvlText w:val="%6."/>
+      <w:lvlJc w:val="left"/>
+      <w:pPr>
+        <w:ind w:left="4320" w:hanging="360"/>
+      </w:pPr>
+    </w:lvl>
+    <w:lvl w:ilvl="6" w:tplc="2048D780">
+      <w:start w:val="1"/>
+      <w:numFmt w:val="decimal"/>
+      <w:lvlText w:val="%7."/>
+      <w:lvlJc w:val="left"/>
+      <w:pPr>
+        <w:ind w:left="5040" w:hanging="360"/>
+      </w:pPr>
+    </w:lvl>
+    <w:lvl w:ilvl="7" w:tplc="EBF6CBA2">
+      <w:start w:val="1"/>
+      <w:numFmt w:val="lowerLetter"/>
+      <w:lvlText w:val="%8."/>
+      <w:lvlJc w:val="left"/>
+      <w:pPr>
+        <w:ind w:left="5760" w:hanging="360"/>
+      </w:pPr>
+    </w:lvl>
+    <w:lvl w:ilvl="8" w:tplc="964A0816">
+      <w:start w:val="1"/>
+      <w:numFmt w:val="lowerRoman"/>
+      <w:lvlText w:val="%9."/>
+      <w:lvlJc w:val="left"/>
+      <w:pPr>
+        <w:ind w:left="6480" w:hanging="360"/>
+      </w:pPr>
+    </w:lvl>
+  </w:abstractNum>
+  <w:abstractNum w:abstractNumId="1" w15:restartNumberingAfterBreak="0">
+    <w:nsid w:val="7560452E"/>
+    <w:multiLevelType w:val="hybridMultilevel"/>
+    <w:tmpl w:val="C13A6918"/>
+    <w:lvl w:ilvl="0" w:tplc="572CA9F0">
       <w:start w:val="1"/>
       <w:numFmt w:val="bullet"/>
       <w:lvlText w:val="•"/>
@@ -3507,7 +3616,7 @@
         <w:ind w:left="720" w:hanging="360"/>
       </w:pPr>
     </w:lvl>
-    <w:lvl w:ilvl="1">
+    <w:lvl w:ilvl="1" w:tplc="C5CCD356">
       <w:start w:val="1"/>
       <w:numFmt w:val="bullet"/>
       <w:lvlText w:val="o"/>
@@ -3516,7 +3625,7 @@
         <w:ind w:left="1440" w:hanging="360"/>
       </w:pPr>
     </w:lvl>
-    <w:lvl w:ilvl="2">
+    <w:lvl w:ilvl="2" w:tplc="16EA5AB6">
       <w:start w:val="1"/>
       <w:numFmt w:val="bullet"/>
       <w:lvlText w:val="▪"/>
@@ -3525,7 +3634,7 @@
         <w:ind w:left="2160" w:hanging="360"/>
       </w:pPr>
     </w:lvl>
-    <w:lvl w:ilvl="3">
+    <w:lvl w:ilvl="3" w:tplc="712C1CA6">
       <w:start w:val="1"/>
       <w:numFmt w:val="bullet"/>
       <w:lvlText w:val="•"/>
@@ -3534,7 +3643,7 @@
         <w:ind w:left="2880" w:hanging="360"/>
       </w:pPr>
     </w:lvl>
-    <w:lvl w:ilvl="4">
+    <w:lvl w:ilvl="4" w:tplc="710EA022">
       <w:start w:val="1"/>
       <w:numFmt w:val="bullet"/>
       <w:lvlText w:val="o"/>
@@ -3543,7 +3652,7 @@
         <w:ind w:left="3600" w:hanging="360"/>
       </w:pPr>
     </w:lvl>
-    <w:lvl w:ilvl="5">
+    <w:lvl w:ilvl="5" w:tplc="C7EC3E42">
       <w:start w:val="1"/>
       <w:numFmt w:val="bullet"/>
       <w:lvlText w:val="▪"/>
@@ -3552,7 +3661,7 @@
         <w:ind w:left="4320" w:hanging="360"/>
       </w:pPr>
     </w:lvl>
-    <w:lvl w:ilvl="6">
+    <w:lvl w:ilvl="6" w:tplc="F5D48286">
       <w:start w:val="1"/>
       <w:numFmt w:val="bullet"/>
       <w:lvlText w:val="•"/>
@@ -3561,7 +3670,7 @@
         <w:ind w:left="5040" w:hanging="360"/>
       </w:pPr>
     </w:lvl>
-    <w:lvl w:ilvl="7">
+    <w:lvl w:ilvl="7" w:tplc="B01A445A">
       <w:start w:val="1"/>
       <w:numFmt w:val="bullet"/>
       <w:lvlText w:val="o"/>
@@ -3570,7 +3679,7 @@
         <w:ind w:left="5760" w:hanging="360"/>
       </w:pPr>
     </w:lvl>
-    <w:lvl w:ilvl="8">
+    <w:lvl w:ilvl="8" w:tplc="9BCC7D84">
       <w:start w:val="1"/>
       <w:numFmt w:val="bullet"/>
       <w:lvlText w:val="▪"/>
@@ -3580,192 +3689,108 @@
       </w:pPr>
     </w:lvl>
   </w:abstractNum>
-  <w:abstractNum w:abstractNumId="1">
-    <w:multiLevelType w:val="hybridMultilevel"/>
-    <w:lvl w:ilvl="0">
-      <w:start w:val="1"/>
-      <w:numFmt w:val="decimal"/>
-      <w:lvlText w:val="%1."/>
-      <w:lvlJc w:val="left"/>
-      <w:pPr>
-        <w:ind w:left="720" w:hanging="360"/>
-      </w:pPr>
-    </w:lvl>
-    <w:lvl w:ilvl="1">
-      <w:start w:val="1"/>
-      <w:numFmt w:val="lowerLetter"/>
-      <w:lvlText w:val="%2."/>
-      <w:lvlJc w:val="left"/>
-      <w:pPr>
-        <w:ind w:left="1440" w:hanging="360"/>
-      </w:pPr>
-    </w:lvl>
-    <w:lvl w:ilvl="2">
-      <w:start w:val="1"/>
-      <w:numFmt w:val="lowerRoman"/>
-      <w:lvlText w:val="%3."/>
-      <w:lvlJc w:val="left"/>
-      <w:pPr>
-        <w:ind w:left="2160" w:hanging="360"/>
-      </w:pPr>
-    </w:lvl>
-    <w:lvl w:ilvl="3">
-      <w:start w:val="1"/>
-      <w:numFmt w:val="decimal"/>
-      <w:lvlText w:val="%4."/>
-      <w:lvlJc w:val="left"/>
-      <w:pPr>
-        <w:ind w:left="2880" w:hanging="360"/>
-      </w:pPr>
-    </w:lvl>
-    <w:lvl w:ilvl="4">
-      <w:start w:val="1"/>
-      <w:numFmt w:val="lowerLetter"/>
-      <w:lvlText w:val="%5."/>
-      <w:lvlJc w:val="left"/>
-      <w:pPr>
-        <w:ind w:left="3600" w:hanging="360"/>
-      </w:pPr>
-    </w:lvl>
-    <w:lvl w:ilvl="5">
-      <w:start w:val="1"/>
-      <w:numFmt w:val="lowerRoman"/>
-      <w:lvlText w:val="%6."/>
-      <w:lvlJc w:val="left"/>
-      <w:pPr>
-        <w:ind w:left="4320" w:hanging="360"/>
-      </w:pPr>
-    </w:lvl>
-    <w:lvl w:ilvl="6">
-      <w:start w:val="1"/>
-      <w:numFmt w:val="decimal"/>
-      <w:lvlText w:val="%7."/>
-      <w:lvlJc w:val="left"/>
-      <w:pPr>
-        <w:ind w:left="5040" w:hanging="360"/>
-      </w:pPr>
-    </w:lvl>
-    <w:lvl w:ilvl="7">
-      <w:start w:val="1"/>
-      <w:numFmt w:val="lowerLetter"/>
-      <w:lvlText w:val="%8."/>
-      <w:lvlJc w:val="left"/>
-      <w:pPr>
-        <w:ind w:left="5760" w:hanging="360"/>
-      </w:pPr>
-    </w:lvl>
-    <w:lvl w:ilvl="8">
-      <w:start w:val="1"/>
-      <w:numFmt w:val="lowerRoman"/>
-      <w:lvlText w:val="%9."/>
-      <w:lvlJc w:val="left"/>
-      <w:pPr>
-        <w:ind w:left="6480" w:hanging="360"/>
-      </w:pPr>
-    </w:lvl>
-  </w:abstractNum>
-  <w:num w:numId="1">
+  <w:num w:numId="1" w16cid:durableId="659698416">
+    <w:abstractNumId w:val="1"/>
+  </w:num>
+  <w:num w:numId="2" w16cid:durableId="77095071">
+    <w:abstractNumId w:val="1"/>
+  </w:num>
+  <w:num w:numId="3" w16cid:durableId="60369158">
     <w:abstractNumId w:val="0"/>
-  </w:num>
-  <w:num w:numId="2">
-    <w:abstractNumId w:val="0"/>
-  </w:num>
-  <w:num w:numId="3">
-    <w:abstractNumId w:val="1"/>
     <w:lvlOverride w:ilvl="0">
       <w:startOverride w:val="1"/>
     </w:lvlOverride>
   </w:num>
-  <w:num w:numId="4">
-    <w:abstractNumId w:val="1"/>
+  <w:num w:numId="4" w16cid:durableId="989672731">
+    <w:abstractNumId w:val="0"/>
     <w:lvlOverride w:ilvl="0">
       <w:startOverride w:val="1"/>
     </w:lvlOverride>
   </w:num>
-  <w:num w:numId="5">
+  <w:num w:numId="5" w16cid:durableId="1009866305">
+    <w:abstractNumId w:val="1"/>
+  </w:num>
+  <w:num w:numId="6" w16cid:durableId="287666619">
     <w:abstractNumId w:val="0"/>
-  </w:num>
-  <w:num w:numId="6">
-    <w:abstractNumId w:val="1"/>
     <w:lvlOverride w:ilvl="0">
       <w:startOverride w:val="1"/>
     </w:lvlOverride>
   </w:num>
-  <w:num w:numId="7">
-    <w:abstractNumId w:val="1"/>
+  <w:num w:numId="7" w16cid:durableId="99764267">
+    <w:abstractNumId w:val="0"/>
     <w:lvlOverride w:ilvl="0">
       <w:startOverride w:val="1"/>
     </w:lvlOverride>
   </w:num>
-  <w:num w:numId="8">
+  <w:num w:numId="8" w16cid:durableId="1481997618">
+    <w:abstractNumId w:val="1"/>
+  </w:num>
+  <w:num w:numId="9" w16cid:durableId="969241177">
+    <w:abstractNumId w:val="1"/>
+  </w:num>
+  <w:num w:numId="10" w16cid:durableId="360673272">
     <w:abstractNumId w:val="0"/>
-  </w:num>
-  <w:num w:numId="9">
-    <w:abstractNumId w:val="0"/>
-  </w:num>
-  <w:num w:numId="10">
-    <w:abstractNumId w:val="1"/>
     <w:lvlOverride w:ilvl="0">
       <w:startOverride w:val="1"/>
     </w:lvlOverride>
   </w:num>
-  <w:num w:numId="11">
-    <w:abstractNumId w:val="1"/>
+  <w:num w:numId="11" w16cid:durableId="507406430">
+    <w:abstractNumId w:val="0"/>
     <w:lvlOverride w:ilvl="0">
       <w:startOverride w:val="1"/>
     </w:lvlOverride>
   </w:num>
-  <w:num w:numId="12">
+  <w:num w:numId="12" w16cid:durableId="269241970">
+    <w:abstractNumId w:val="1"/>
+  </w:num>
+  <w:num w:numId="13" w16cid:durableId="483356958">
     <w:abstractNumId w:val="0"/>
-  </w:num>
-  <w:num w:numId="13">
-    <w:abstractNumId w:val="1"/>
     <w:lvlOverride w:ilvl="0">
       <w:startOverride w:val="1"/>
     </w:lvlOverride>
   </w:num>
-  <w:num w:numId="14">
+  <w:num w:numId="14" w16cid:durableId="131141538">
+    <w:abstractNumId w:val="1"/>
+  </w:num>
+  <w:num w:numId="15" w16cid:durableId="1899853511">
+    <w:abstractNumId w:val="1"/>
+  </w:num>
+  <w:num w:numId="16" w16cid:durableId="1844860282">
     <w:abstractNumId w:val="0"/>
-  </w:num>
-  <w:num w:numId="15">
-    <w:abstractNumId w:val="0"/>
-  </w:num>
-  <w:num w:numId="16">
-    <w:abstractNumId w:val="1"/>
     <w:lvlOverride w:ilvl="0">
       <w:startOverride w:val="1"/>
     </w:lvlOverride>
   </w:num>
-  <w:num w:numId="17">
-    <w:abstractNumId w:val="1"/>
+  <w:num w:numId="17" w16cid:durableId="912737917">
+    <w:abstractNumId w:val="0"/>
     <w:lvlOverride w:ilvl="0">
       <w:startOverride w:val="1"/>
     </w:lvlOverride>
   </w:num>
-  <w:num w:numId="18">
-    <w:abstractNumId w:val="1"/>
+  <w:num w:numId="18" w16cid:durableId="1093168220">
+    <w:abstractNumId w:val="0"/>
     <w:lvlOverride w:ilvl="0">
       <w:startOverride w:val="1"/>
     </w:lvlOverride>
   </w:num>
-  <w:num w:numId="19">
-    <w:abstractNumId w:val="0"/>
+  <w:num w:numId="19" w16cid:durableId="1197893936">
+    <w:abstractNumId w:val="1"/>
   </w:num>
-  <w:num w:numId="20">
-    <w:abstractNumId w:val="0"/>
+  <w:num w:numId="20" w16cid:durableId="1806854965">
+    <w:abstractNumId w:val="1"/>
   </w:num>
 </w:numbering>
 </file>
 
 <file path=word/styles.xml><?xml version="1.0" encoding="utf-8"?>
-<w:styles xmlns:w="http://schemas.openxmlformats.org/wordprocessingml/2006/main">
+<w:styles xmlns:mc="http://schemas.openxmlformats.org/markup-compatibility/2006" xmlns:r="http://schemas.openxmlformats.org/officeDocument/2006/relationships" xmlns:w="http://schemas.openxmlformats.org/wordprocessingml/2006/main" xmlns:w14="http://schemas.microsoft.com/office/word/2010/wordml" xmlns:w15="http://schemas.microsoft.com/office/word/2012/wordml" xmlns:w16cex="http://schemas.microsoft.com/office/word/2018/wordml/cex" xmlns:w16cid="http://schemas.microsoft.com/office/word/2016/wordml/cid" xmlns:w16="http://schemas.microsoft.com/office/word/2018/wordml" xmlns:w16du="http://schemas.microsoft.com/office/word/2023/wordml/word16du" xmlns:w16sdtdh="http://schemas.microsoft.com/office/word/2020/wordml/sdtdatahash" xmlns:w16sdtfl="http://schemas.microsoft.com/office/word/2024/wordml/sdtformatlock" xmlns:w16se="http://schemas.microsoft.com/office/word/2015/wordml/symex" mc:Ignorable="w14 w15 w16se w16cid w16 w16cex w16sdtdh w16sdtfl w16du">
   <w:docDefaults>
     <w:rPrDefault>
       <w:rPr>
-        <w:rFonts w:ascii="Calibri" w:hAnsi="Calibri" w:eastAsia="Calibri" w:cs="Calibri"/>
+        <w:rFonts w:ascii="Calibri" w:eastAsia="Calibri" w:hAnsi="Calibri" w:cs="Calibri"/>
         <w:sz w:val="22"/>
         <w:szCs w:val="22"/>
-        <w:lang w:val="en-US"/>
+        <w:lang w:val="en-US" w:eastAsia="en-US" w:bidi="ar-SA"/>
       </w:rPr>
     </w:rPrDefault>
     <w:pPrDefault>
@@ -3774,6 +3799,384 @@
       </w:pPr>
     </w:pPrDefault>
   </w:docDefaults>
+  <w:latentStyles w:defLockedState="0" w:defUIPriority="99" w:defSemiHidden="0" w:defUnhideWhenUsed="0" w:defQFormat="0" w:count="376">
+    <w:lsdException w:name="Normal" w:uiPriority="0" w:qFormat="1"/>
+    <w:lsdException w:name="heading 1" w:uiPriority="9" w:qFormat="1"/>
+    <w:lsdException w:name="heading 2" w:semiHidden="1" w:uiPriority="9" w:unhideWhenUsed="1" w:qFormat="1"/>
+    <w:lsdException w:name="heading 3" w:semiHidden="1" w:uiPriority="9" w:unhideWhenUsed="1" w:qFormat="1"/>
+    <w:lsdException w:name="heading 4" w:semiHidden="1" w:uiPriority="9" w:unhideWhenUsed="1" w:qFormat="1"/>
+    <w:lsdException w:name="heading 5" w:semiHidden="1" w:uiPriority="9" w:unhideWhenUsed="1" w:qFormat="1"/>
+    <w:lsdException w:name="heading 6" w:semiHidden="1" w:uiPriority="9" w:unhideWhenUsed="1" w:qFormat="1"/>
+    <w:lsdException w:name="heading 7" w:semiHidden="1" w:uiPriority="9" w:unhideWhenUsed="1" w:qFormat="1"/>
+    <w:lsdException w:name="heading 8" w:semiHidden="1" w:uiPriority="9" w:unhideWhenUsed="1" w:qFormat="1"/>
+    <w:lsdException w:name="heading 9" w:semiHidden="1" w:uiPriority="9" w:unhideWhenUsed="1" w:qFormat="1"/>
+    <w:lsdException w:name="index 1" w:semiHidden="1" w:unhideWhenUsed="1"/>
+    <w:lsdException w:name="index 2" w:semiHidden="1" w:unhideWhenUsed="1"/>
+    <w:lsdException w:name="index 3" w:semiHidden="1" w:unhideWhenUsed="1"/>
+    <w:lsdException w:name="index 4" w:semiHidden="1" w:unhideWhenUsed="1"/>
+    <w:lsdException w:name="index 5" w:semiHidden="1" w:unhideWhenUsed="1"/>
+    <w:lsdException w:name="index 6" w:semiHidden="1" w:unhideWhenUsed="1"/>
+    <w:lsdException w:name="index 7" w:semiHidden="1" w:unhideWhenUsed="1"/>
+    <w:lsdException w:name="index 8" w:semiHidden="1" w:unhideWhenUsed="1"/>
+    <w:lsdException w:name="index 9" w:semiHidden="1" w:unhideWhenUsed="1"/>
+    <w:lsdException w:name="toc 1" w:semiHidden="1" w:uiPriority="39" w:unhideWhenUsed="1"/>
+    <w:lsdException w:name="toc 2" w:semiHidden="1" w:uiPriority="39" w:unhideWhenUsed="1"/>
+    <w:lsdException w:name="toc 3" w:semiHidden="1" w:uiPriority="39" w:unhideWhenUsed="1"/>
+    <w:lsdException w:name="toc 4" w:semiHidden="1" w:uiPriority="39" w:unhideWhenUsed="1"/>
+    <w:lsdException w:name="toc 5" w:semiHidden="1" w:uiPriority="39" w:unhideWhenUsed="1"/>
+    <w:lsdException w:name="toc 6" w:semiHidden="1" w:uiPriority="39" w:unhideWhenUsed="1"/>
+    <w:lsdException w:name="toc 7" w:semiHidden="1" w:uiPriority="39" w:unhideWhenUsed="1"/>
+    <w:lsdException w:name="toc 8" w:semiHidden="1" w:uiPriority="39" w:unhideWhenUsed="1"/>
+    <w:lsdException w:name="toc 9" w:semiHidden="1" w:uiPriority="39" w:unhideWhenUsed="1"/>
+    <w:lsdException w:name="Normal Indent" w:semiHidden="1" w:unhideWhenUsed="1"/>
+    <w:lsdException w:name="footnote text" w:semiHidden="1" w:unhideWhenUsed="1"/>
+    <w:lsdException w:name="annotation text" w:semiHidden="1" w:unhideWhenUsed="1"/>
+    <w:lsdException w:name="header" w:semiHidden="1" w:unhideWhenUsed="1"/>
+    <w:lsdException w:name="footer" w:semiHidden="1" w:unhideWhenUsed="1"/>
+    <w:lsdException w:name="index heading" w:semiHidden="1" w:unhideWhenUsed="1"/>
+    <w:lsdException w:name="caption" w:semiHidden="1" w:uiPriority="35" w:unhideWhenUsed="1" w:qFormat="1"/>
+    <w:lsdException w:name="table of figures" w:semiHidden="1" w:unhideWhenUsed="1"/>
+    <w:lsdException w:name="envelope address" w:semiHidden="1" w:unhideWhenUsed="1"/>
+    <w:lsdException w:name="envelope return" w:semiHidden="1" w:unhideWhenUsed="1"/>
+    <w:lsdException w:name="footnote reference" w:semiHidden="1" w:unhideWhenUsed="1"/>
+    <w:lsdException w:name="annotation reference" w:semiHidden="1" w:unhideWhenUsed="1"/>
+    <w:lsdException w:name="line number" w:semiHidden="1" w:unhideWhenUsed="1"/>
+    <w:lsdException w:name="page number" w:semiHidden="1" w:unhideWhenUsed="1"/>
+    <w:lsdException w:name="endnote reference" w:semiHidden="1" w:unhideWhenUsed="1"/>
+    <w:lsdException w:name="endnote text" w:semiHidden="1" w:unhideWhenUsed="1"/>
+    <w:lsdException w:name="table of authorities" w:semiHidden="1" w:unhideWhenUsed="1"/>
+    <w:lsdException w:name="macro" w:semiHidden="1" w:unhideWhenUsed="1"/>
+    <w:lsdException w:name="toa heading" w:semiHidden="1" w:unhideWhenUsed="1"/>
+    <w:lsdException w:name="List" w:semiHidden="1" w:unhideWhenUsed="1"/>
+    <w:lsdException w:name="List Bullet" w:semiHidden="1" w:unhideWhenUsed="1"/>
+    <w:lsdException w:name="List Number" w:semiHidden="1" w:unhideWhenUsed="1"/>
+    <w:lsdException w:name="List 2" w:semiHidden="1" w:unhideWhenUsed="1"/>
+    <w:lsdException w:name="List 3" w:semiHidden="1" w:unhideWhenUsed="1"/>
+    <w:lsdException w:name="List 4" w:semiHidden="1" w:unhideWhenUsed="1"/>
+    <w:lsdException w:name="List 5" w:semiHidden="1" w:unhideWhenUsed="1"/>
+    <w:lsdException w:name="List Bullet 2" w:semiHidden="1" w:unhideWhenUsed="1"/>
+    <w:lsdException w:name="List Bullet 3" w:semiHidden="1" w:unhideWhenUsed="1"/>
+    <w:lsdException w:name="List Bullet 4" w:semiHidden="1" w:unhideWhenUsed="1"/>
+    <w:lsdException w:name="List Bullet 5" w:semiHidden="1" w:unhideWhenUsed="1"/>
+    <w:lsdException w:name="List Number 2" w:semiHidden="1" w:unhideWhenUsed="1"/>
+    <w:lsdException w:name="List Number 3" w:semiHidden="1" w:unhideWhenUsed="1"/>
+    <w:lsdException w:name="List Number 4" w:semiHidden="1" w:unhideWhenUsed="1"/>
+    <w:lsdException w:name="List Number 5" w:semiHidden="1" w:unhideWhenUsed="1"/>
+    <w:lsdException w:name="Title" w:uiPriority="10" w:qFormat="1"/>
+    <w:lsdException w:name="Closing" w:semiHidden="1" w:unhideWhenUsed="1"/>
+    <w:lsdException w:name="Signature" w:semiHidden="1" w:unhideWhenUsed="1"/>
+    <w:lsdException w:name="Default Paragraph Font" w:semiHidden="1" w:uiPriority="1" w:unhideWhenUsed="1"/>
+    <w:lsdException w:name="Body Text" w:semiHidden="1" w:unhideWhenUsed="1"/>
+    <w:lsdException w:name="Body Text Indent" w:semiHidden="1" w:unhideWhenUsed="1"/>
+    <w:lsdException w:name="List Continue" w:semiHidden="1" w:unhideWhenUsed="1"/>
+    <w:lsdException w:name="List Continue 2" w:semiHidden="1" w:unhideWhenUsed="1"/>
+    <w:lsdException w:name="List Continue 3" w:semiHidden="1" w:unhideWhenUsed="1"/>
+    <w:lsdException w:name="List Continue 4" w:semiHidden="1" w:unhideWhenUsed="1"/>
+    <w:lsdException w:name="List Continue 5" w:semiHidden="1" w:unhideWhenUsed="1"/>
+    <w:lsdException w:name="Message Header" w:semiHidden="1" w:unhideWhenUsed="1"/>
+    <w:lsdException w:name="Subtitle" w:uiPriority="11" w:qFormat="1"/>
+    <w:lsdException w:name="Salutation" w:semiHidden="1" w:unhideWhenUsed="1"/>
+    <w:lsdException w:name="Date" w:semiHidden="1" w:unhideWhenUsed="1"/>
+    <w:lsdException w:name="Body Text First Indent" w:semiHidden="1" w:unhideWhenUsed="1"/>
+    <w:lsdException w:name="Body Text First Indent 2" w:semiHidden="1" w:unhideWhenUsed="1"/>
+    <w:lsdException w:name="Note Heading" w:semiHidden="1" w:unhideWhenUsed="1"/>
+    <w:lsdException w:name="Body Text 2" w:semiHidden="1" w:unhideWhenUsed="1"/>
+    <w:lsdException w:name="Body Text 3" w:semiHidden="1" w:unhideWhenUsed="1"/>
+    <w:lsdException w:name="Body Text Indent 2" w:semiHidden="1" w:unhideWhenUsed="1"/>
+    <w:lsdException w:name="Body Text Indent 3" w:semiHidden="1" w:unhideWhenUsed="1"/>
+    <w:lsdException w:name="Block Text" w:semiHidden="1" w:unhideWhenUsed="1"/>
+    <w:lsdException w:name="Hyperlink" w:semiHidden="1" w:unhideWhenUsed="1"/>
+    <w:lsdException w:name="FollowedHyperlink" w:semiHidden="1" w:unhideWhenUsed="1"/>
+    <w:lsdException w:name="Strong" w:uiPriority="22" w:qFormat="1"/>
+    <w:lsdException w:name="Emphasis" w:uiPriority="20" w:qFormat="1"/>
+    <w:lsdException w:name="Document Map" w:semiHidden="1" w:unhideWhenUsed="1"/>
+    <w:lsdException w:name="Plain Text" w:semiHidden="1" w:unhideWhenUsed="1"/>
+    <w:lsdException w:name="E-mail Signature" w:semiHidden="1" w:unhideWhenUsed="1"/>
+    <w:lsdException w:name="HTML Top of Form" w:semiHidden="1" w:unhideWhenUsed="1"/>
+    <w:lsdException w:name="HTML Bottom of Form" w:semiHidden="1" w:unhideWhenUsed="1"/>
+    <w:lsdException w:name="Normal (Web)" w:semiHidden="1" w:unhideWhenUsed="1"/>
+    <w:lsdException w:name="HTML Acronym" w:semiHidden="1" w:unhideWhenUsed="1"/>
+    <w:lsdException w:name="HTML Address" w:semiHidden="1" w:unhideWhenUsed="1"/>
+    <w:lsdException w:name="HTML Cite" w:semiHidden="1" w:unhideWhenUsed="1"/>
+    <w:lsdException w:name="HTML Code" w:semiHidden="1" w:unhideWhenUsed="1"/>
+    <w:lsdException w:name="HTML Definition" w:semiHidden="1" w:unhideWhenUsed="1"/>
+    <w:lsdException w:name="HTML Keyboard" w:semiHidden="1" w:unhideWhenUsed="1"/>
+    <w:lsdException w:name="HTML Preformatted" w:semiHidden="1" w:unhideWhenUsed="1"/>
+    <w:lsdException w:name="HTML Sample" w:semiHidden="1" w:unhideWhenUsed="1"/>
+    <w:lsdException w:name="HTML Typewriter" w:semiHidden="1" w:unhideWhenUsed="1"/>
+    <w:lsdException w:name="HTML Variable" w:semiHidden="1" w:unhideWhenUsed="1"/>
+    <w:lsdException w:name="Normal Table" w:semiHidden="1" w:unhideWhenUsed="1"/>
+    <w:lsdException w:name="annotation subject" w:semiHidden="1" w:unhideWhenUsed="1"/>
+    <w:lsdException w:name="No List" w:semiHidden="1" w:unhideWhenUsed="1"/>
+    <w:lsdException w:name="Outline List 1" w:semiHidden="1" w:unhideWhenUsed="1"/>
+    <w:lsdException w:name="Outline List 2" w:semiHidden="1" w:unhideWhenUsed="1"/>
+    <w:lsdException w:name="Outline List 3" w:semiHidden="1" w:unhideWhenUsed="1"/>
+    <w:lsdException w:name="Table Simple 1" w:semiHidden="1" w:unhideWhenUsed="1"/>
+    <w:lsdException w:name="Table Simple 2" w:semiHidden="1" w:unhideWhenUsed="1"/>
+    <w:lsdException w:name="Table Simple 3" w:semiHidden="1" w:unhideWhenUsed="1"/>
+    <w:lsdException w:name="Table Classic 1" w:semiHidden="1" w:unhideWhenUsed="1"/>
+    <w:lsdException w:name="Table Classic 2" w:semiHidden="1" w:unhideWhenUsed="1"/>
+    <w:lsdException w:name="Table Classic 3" w:semiHidden="1" w:unhideWhenUsed="1"/>
+    <w:lsdException w:name="Table Classic 4" w:semiHidden="1" w:unhideWhenUsed="1"/>
+    <w:lsdException w:name="Table Colorful 1" w:semiHidden="1" w:unhideWhenUsed="1"/>
+    <w:lsdException w:name="Table Colorful 2" w:semiHidden="1" w:unhideWhenUsed="1"/>
+    <w:lsdException w:name="Table Colorful 3" w:semiHidden="1" w:unhideWhenUsed="1"/>
+    <w:lsdException w:name="Table Columns 1" w:semiHidden="1" w:unhideWhenUsed="1"/>
+    <w:lsdException w:name="Table Columns 2" w:semiHidden="1" w:unhideWhenUsed="1"/>
+    <w:lsdException w:name="Table Columns 3" w:semiHidden="1" w:unhideWhenUsed="1"/>
+    <w:lsdException w:name="Table Columns 4" w:semiHidden="1" w:unhideWhenUsed="1"/>
+    <w:lsdException w:name="Table Columns 5" w:semiHidden="1" w:unhideWhenUsed="1"/>
+    <w:lsdException w:name="Table Grid 1" w:semiHidden="1" w:unhideWhenUsed="1"/>
+    <w:lsdException w:name="Table Grid 2" w:semiHidden="1" w:unhideWhenUsed="1"/>
+    <w:lsdException w:name="Table Grid 3" w:semiHidden="1" w:unhideWhenUsed="1"/>
+    <w:lsdException w:name="Table Grid 4" w:semiHidden="1" w:unhideWhenUsed="1"/>
+    <w:lsdException w:name="Table Grid 5" w:semiHidden="1" w:unhideWhenUsed="1"/>
+    <w:lsdException w:name="Table Grid 6" w:semiHidden="1" w:unhideWhenUsed="1"/>
+    <w:lsdException w:name="Table Grid 7" w:semiHidden="1" w:unhideWhenUsed="1"/>
+    <w:lsdException w:name="Table Grid 8" w:semiHidden="1" w:unhideWhenUsed="1"/>
+    <w:lsdException w:name="Table List 1" w:semiHidden="1" w:unhideWhenUsed="1"/>
+    <w:lsdException w:name="Table List 2" w:semiHidden="1" w:unhideWhenUsed="1"/>
+    <w:lsdException w:name="Table List 3" w:semiHidden="1" w:unhideWhenUsed="1"/>
+    <w:lsdException w:name="Table List 4" w:semiHidden="1" w:unhideWhenUsed="1"/>
+    <w:lsdException w:name="Table List 5" w:semiHidden="1" w:unhideWhenUsed="1"/>
+    <w:lsdException w:name="Table List 6" w:semiHidden="1" w:unhideWhenUsed="1"/>
+    <w:lsdException w:name="Table List 7" w:semiHidden="1" w:unhideWhenUsed="1"/>
+    <w:lsdException w:name="Table List 8" w:semiHidden="1" w:unhideWhenUsed="1"/>
+    <w:lsdException w:name="Table 3D effects 1" w:semiHidden="1" w:unhideWhenUsed="1"/>
+    <w:lsdException w:name="Table 3D effects 2" w:semiHidden="1" w:unhideWhenUsed="1"/>
+    <w:lsdException w:name="Table 3D effects 3" w:semiHidden="1" w:unhideWhenUsed="1"/>
+    <w:lsdException w:name="Table Contemporary" w:semiHidden="1" w:unhideWhenUsed="1"/>
+    <w:lsdException w:name="Table Elegant" w:semiHidden="1" w:unhideWhenUsed="1"/>
+    <w:lsdException w:name="Table Professional" w:semiHidden="1" w:unhideWhenUsed="1"/>
+    <w:lsdException w:name="Table Subtle 1" w:semiHidden="1" w:unhideWhenUsed="1"/>
+    <w:lsdException w:name="Table Subtle 2" w:semiHidden="1" w:unhideWhenUsed="1"/>
+    <w:lsdException w:name="Table Web 1" w:semiHidden="1" w:unhideWhenUsed="1"/>
+    <w:lsdException w:name="Table Web 2" w:semiHidden="1" w:unhideWhenUsed="1"/>
+    <w:lsdException w:name="Table Web 3" w:semiHidden="1" w:unhideWhenUsed="1"/>
+    <w:lsdException w:name="Balloon Text" w:semiHidden="1" w:unhideWhenUsed="1"/>
+    <w:lsdException w:name="Table Grid" w:uiPriority="39"/>
+    <w:lsdException w:name="Table Theme" w:semiHidden="1" w:unhideWhenUsed="1"/>
+    <w:lsdException w:name="Placeholder Text" w:semiHidden="1"/>
+    <w:lsdException w:name="No Spacing" w:uiPriority="1" w:qFormat="1"/>
+    <w:lsdException w:name="Light Shading" w:uiPriority="60"/>
+    <w:lsdException w:name="Light List" w:uiPriority="61"/>
+    <w:lsdException w:name="Light Grid" w:uiPriority="62"/>
+    <w:lsdException w:name="Medium Shading 1" w:uiPriority="63"/>
+    <w:lsdException w:name="Medium Shading 2" w:uiPriority="64"/>
+    <w:lsdException w:name="Medium List 1" w:uiPriority="65"/>
+    <w:lsdException w:name="Medium List 2" w:uiPriority="66"/>
+    <w:lsdException w:name="Medium Grid 1" w:uiPriority="67"/>
+    <w:lsdException w:name="Medium Grid 2" w:uiPriority="68"/>
+    <w:lsdException w:name="Medium Grid 3" w:uiPriority="69"/>
+    <w:lsdException w:name="Dark List" w:uiPriority="70"/>
+    <w:lsdException w:name="Colorful Shading" w:uiPriority="71"/>
+    <w:lsdException w:name="Colorful List" w:uiPriority="72"/>
+    <w:lsdException w:name="Colorful Grid" w:uiPriority="73"/>
+    <w:lsdException w:name="Light Shading Accent 1" w:uiPriority="60"/>
+    <w:lsdException w:name="Light List Accent 1" w:uiPriority="61"/>
+    <w:lsdException w:name="Light Grid Accent 1" w:uiPriority="62"/>
+    <w:lsdException w:name="Medium Shading 1 Accent 1" w:uiPriority="63"/>
+    <w:lsdException w:name="Medium Shading 2 Accent 1" w:uiPriority="64"/>
+    <w:lsdException w:name="Medium List 1 Accent 1" w:uiPriority="65"/>
+    <w:lsdException w:name="Revision" w:semiHidden="1"/>
+    <w:lsdException w:name="List Paragraph" w:uiPriority="34" w:qFormat="1"/>
+    <w:lsdException w:name="Quote" w:uiPriority="29" w:qFormat="1"/>
+    <w:lsdException w:name="Intense Quote" w:uiPriority="30" w:qFormat="1"/>
+    <w:lsdException w:name="Medium List 2 Accent 1" w:uiPriority="66"/>
+    <w:lsdException w:name="Medium Grid 1 Accent 1" w:uiPriority="67"/>
+    <w:lsdException w:name="Medium Grid 2 Accent 1" w:uiPriority="68"/>
+    <w:lsdException w:name="Medium Grid 3 Accent 1" w:uiPriority="69"/>
+    <w:lsdException w:name="Dark List Accent 1" w:uiPriority="70"/>
+    <w:lsdException w:name="Colorful Shading Accent 1" w:uiPriority="71"/>
+    <w:lsdException w:name="Colorful List Accent 1" w:uiPriority="72"/>
+    <w:lsdException w:name="Colorful Grid Accent 1" w:uiPriority="73"/>
+    <w:lsdException w:name="Light Shading Accent 2" w:uiPriority="60"/>
+    <w:lsdException w:name="Light List Accent 2" w:uiPriority="61"/>
+    <w:lsdException w:name="Light Grid Accent 2" w:uiPriority="62"/>
+    <w:lsdException w:name="Medium Shading 1 Accent 2" w:uiPriority="63"/>
+    <w:lsdException w:name="Medium Shading 2 Accent 2" w:uiPriority="64"/>
+    <w:lsdException w:name="Medium List 1 Accent 2" w:uiPriority="65"/>
+    <w:lsdException w:name="Medium List 2 Accent 2" w:uiPriority="66"/>
+    <w:lsdException w:name="Medium Grid 1 Accent 2" w:uiPriority="67"/>
+    <w:lsdException w:name="Medium Grid 2 Accent 2" w:uiPriority="68"/>
+    <w:lsdException w:name="Medium Grid 3 Accent 2" w:uiPriority="69"/>
+    <w:lsdException w:name="Dark List Accent 2" w:uiPriority="70"/>
+    <w:lsdException w:name="Colorful Shading Accent 2" w:uiPriority="71"/>
+    <w:lsdException w:name="Colorful List Accent 2" w:uiPriority="72"/>
+    <w:lsdException w:name="Colorful Grid Accent 2" w:uiPriority="73"/>
+    <w:lsdException w:name="Light Shading Accent 3" w:uiPriority="60"/>
+    <w:lsdException w:name="Light List Accent 3" w:uiPriority="61"/>
+    <w:lsdException w:name="Light Grid Accent 3" w:uiPriority="62"/>
+    <w:lsdException w:name="Medium Shading 1 Accent 3" w:uiPriority="63"/>
+    <w:lsdException w:name="Medium Shading 2 Accent 3" w:uiPriority="64"/>
+    <w:lsdException w:name="Medium List 1 Accent 3" w:uiPriority="65"/>
+    <w:lsdException w:name="Medium List 2 Accent 3" w:uiPriority="66"/>
+    <w:lsdException w:name="Medium Grid 1 Accent 3" w:uiPriority="67"/>
+    <w:lsdException w:name="Medium Grid 2 Accent 3" w:uiPriority="68"/>
+    <w:lsdException w:name="Medium Grid 3 Accent 3" w:uiPriority="69"/>
+    <w:lsdException w:name="Dark List Accent 3" w:uiPriority="70"/>
+    <w:lsdException w:name="Colorful Shading Accent 3" w:uiPriority="71"/>
+    <w:lsdException w:name="Colorful List Accent 3" w:uiPriority="72"/>
+    <w:lsdException w:name="Colorful Grid Accent 3" w:uiPriority="73"/>
+    <w:lsdException w:name="Light Shading Accent 4" w:uiPriority="60"/>
+    <w:lsdException w:name="Light List Accent 4" w:uiPriority="61"/>
+    <w:lsdException w:name="Light Grid Accent 4" w:uiPriority="62"/>
+    <w:lsdException w:name="Medium Shading 1 Accent 4" w:uiPriority="63"/>
+    <w:lsdException w:name="Medium Shading 2 Accent 4" w:uiPriority="64"/>
+    <w:lsdException w:name="Medium List 1 Accent 4" w:uiPriority="65"/>
+    <w:lsdException w:name="Medium List 2 Accent 4" w:uiPriority="66"/>
+    <w:lsdException w:name="Medium Grid 1 Accent 4" w:uiPriority="67"/>
+    <w:lsdException w:name="Medium Grid 2 Accent 4" w:uiPriority="68"/>
+    <w:lsdException w:name="Medium Grid 3 Accent 4" w:uiPriority="69"/>
+    <w:lsdException w:name="Dark List Accent 4" w:uiPriority="70"/>
+    <w:lsdException w:name="Colorful Shading Accent 4" w:uiPriority="71"/>
+    <w:lsdException w:name="Colorful List Accent 4" w:uiPriority="72"/>
+    <w:lsdException w:name="Colorful Grid Accent 4" w:uiPriority="73"/>
+    <w:lsdException w:name="Light Shading Accent 5" w:uiPriority="60"/>
+    <w:lsdException w:name="Light List Accent 5" w:uiPriority="61"/>
+    <w:lsdException w:name="Light Grid Accent 5" w:uiPriority="62"/>
+    <w:lsdException w:name="Medium Shading 1 Accent 5" w:uiPriority="63"/>
+    <w:lsdException w:name="Medium Shading 2 Accent 5" w:uiPriority="64"/>
+    <w:lsdException w:name="Medium List 1 Accent 5" w:uiPriority="65"/>
+    <w:lsdException w:name="Medium List 2 Accent 5" w:uiPriority="66"/>
+    <w:lsdException w:name="Medium Grid 1 Accent 5" w:uiPriority="67"/>
+    <w:lsdException w:name="Medium Grid 2 Accent 5" w:uiPriority="68"/>
+    <w:lsdException w:name="Medium Grid 3 Accent 5" w:uiPriority="69"/>
+    <w:lsdException w:name="Dark List Accent 5" w:uiPriority="70"/>
+    <w:lsdException w:name="Colorful Shading Accent 5" w:uiPriority="71"/>
+    <w:lsdException w:name="Colorful List Accent 5" w:uiPriority="72"/>
+    <w:lsdException w:name="Colorful Grid Accent 5" w:uiPriority="73"/>
+    <w:lsdException w:name="Light Shading Accent 6" w:uiPriority="60"/>
+    <w:lsdException w:name="Light List Accent 6" w:uiPriority="61"/>
+    <w:lsdException w:name="Light Grid Accent 6" w:uiPriority="62"/>
+    <w:lsdException w:name="Medium Shading 1 Accent 6" w:uiPriority="63"/>
+    <w:lsdException w:name="Medium Shading 2 Accent 6" w:uiPriority="64"/>
+    <w:lsdException w:name="Medium List 1 Accent 6" w:uiPriority="65"/>
+    <w:lsdException w:name="Medium List 2 Accent 6" w:uiPriority="66"/>
+    <w:lsdException w:name="Medium Grid 1 Accent 6" w:uiPriority="67"/>
+    <w:lsdException w:name="Medium Grid 2 Accent 6" w:uiPriority="68"/>
+    <w:lsdException w:name="Medium Grid 3 Accent 6" w:uiPriority="69"/>
+    <w:lsdException w:name="Dark List Accent 6" w:uiPriority="70"/>
+    <w:lsdException w:name="Colorful Shading Accent 6" w:uiPriority="71"/>
+    <w:lsdException w:name="Colorful List Accent 6" w:uiPriority="72"/>
+    <w:lsdException w:name="Colorful Grid Accent 6" w:uiPriority="73"/>
+    <w:lsdException w:name="Subtle Emphasis" w:uiPriority="19" w:qFormat="1"/>
+    <w:lsdException w:name="Intense Emphasis" w:uiPriority="21" w:qFormat="1"/>
+    <w:lsdException w:name="Subtle Reference" w:uiPriority="31" w:qFormat="1"/>
+    <w:lsdException w:name="Intense Reference" w:uiPriority="32" w:qFormat="1"/>
+    <w:lsdException w:name="Book Title" w:uiPriority="33" w:qFormat="1"/>
+    <w:lsdException w:name="Bibliography" w:semiHidden="1" w:uiPriority="37" w:unhideWhenUsed="1"/>
+    <w:lsdException w:name="TOC Heading" w:semiHidden="1" w:uiPriority="39" w:unhideWhenUsed="1" w:qFormat="1"/>
+    <w:lsdException w:name="Plain Table 1" w:uiPriority="41"/>
+    <w:lsdException w:name="Plain Table 2" w:uiPriority="42"/>
+    <w:lsdException w:name="Plain Table 3" w:uiPriority="43"/>
+    <w:lsdException w:name="Plain Table 4" w:uiPriority="44"/>
+    <w:lsdException w:name="Plain Table 5" w:uiPriority="45"/>
+    <w:lsdException w:name="Grid Table Light" w:uiPriority="40"/>
+    <w:lsdException w:name="Grid Table 1 Light" w:uiPriority="46"/>
+    <w:lsdException w:name="Grid Table 2" w:uiPriority="47"/>
+    <w:lsdException w:name="Grid Table 3" w:uiPriority="48"/>
+    <w:lsdException w:name="Grid Table 4" w:uiPriority="49"/>
+    <w:lsdException w:name="Grid Table 5 Dark" w:uiPriority="50"/>
+    <w:lsdException w:name="Grid Table 6 Colorful" w:uiPriority="51"/>
+    <w:lsdException w:name="Grid Table 7 Colorful" w:uiPriority="52"/>
+    <w:lsdException w:name="Grid Table 1 Light Accent 1" w:uiPriority="46"/>
+    <w:lsdException w:name="Grid Table 2 Accent 1" w:uiPriority="47"/>
+    <w:lsdException w:name="Grid Table 3 Accent 1" w:uiPriority="48"/>
+    <w:lsdException w:name="Grid Table 4 Accent 1" w:uiPriority="49"/>
+    <w:lsdException w:name="Grid Table 5 Dark Accent 1" w:uiPriority="50"/>
+    <w:lsdException w:name="Grid Table 6 Colorful Accent 1" w:uiPriority="51"/>
+    <w:lsdException w:name="Grid Table 7 Colorful Accent 1" w:uiPriority="52"/>
+    <w:lsdException w:name="Grid Table 1 Light Accent 2" w:uiPriority="46"/>
+    <w:lsdException w:name="Grid Table 2 Accent 2" w:uiPriority="47"/>
+    <w:lsdException w:name="Grid Table 3 Accent 2" w:uiPriority="48"/>
+    <w:lsdException w:name="Grid Table 4 Accent 2" w:uiPriority="49"/>
+    <w:lsdException w:name="Grid Table 5 Dark Accent 2" w:uiPriority="50"/>
+    <w:lsdException w:name="Grid Table 6 Colorful Accent 2" w:uiPriority="51"/>
+    <w:lsdException w:name="Grid Table 7 Colorful Accent 2" w:uiPriority="52"/>
+    <w:lsdException w:name="Grid Table 1 Light Accent 3" w:uiPriority="46"/>
+    <w:lsdException w:name="Grid Table 2 Accent 3" w:uiPriority="47"/>
+    <w:lsdException w:name="Grid Table 3 Accent 3" w:uiPriority="48"/>
+    <w:lsdException w:name="Grid Table 4 Accent 3" w:uiPriority="49"/>
+    <w:lsdException w:name="Grid Table 5 Dark Accent 3" w:uiPriority="50"/>
+    <w:lsdException w:name="Grid Table 6 Colorful Accent 3" w:uiPriority="51"/>
+    <w:lsdException w:name="Grid Table 7 Colorful Accent 3" w:uiPriority="52"/>
+    <w:lsdException w:name="Grid Table 1 Light Accent 4" w:uiPriority="46"/>
+    <w:lsdException w:name="Grid Table 2 Accent 4" w:uiPriority="47"/>
+    <w:lsdException w:name="Grid Table 3 Accent 4" w:uiPriority="48"/>
+    <w:lsdException w:name="Grid Table 4 Accent 4" w:uiPriority="49"/>
+    <w:lsdException w:name="Grid Table 5 Dark Accent 4" w:uiPriority="50"/>
+    <w:lsdException w:name="Grid Table 6 Colorful Accent 4" w:uiPriority="51"/>
+    <w:lsdException w:name="Grid Table 7 Colorful Accent 4" w:uiPriority="52"/>
+    <w:lsdException w:name="Grid Table 1 Light Accent 5" w:uiPriority="46"/>
+    <w:lsdException w:name="Grid Table 2 Accent 5" w:uiPriority="47"/>
+    <w:lsdException w:name="Grid Table 3 Accent 5" w:uiPriority="48"/>
+    <w:lsdException w:name="Grid Table 4 Accent 5" w:uiPriority="49"/>
+    <w:lsdException w:name="Grid Table 5 Dark Accent 5" w:uiPriority="50"/>
+    <w:lsdException w:name="Grid Table 6 Colorful Accent 5" w:uiPriority="51"/>
+    <w:lsdException w:name="Grid Table 7 Colorful Accent 5" w:uiPriority="52"/>
+    <w:lsdException w:name="Grid Table 1 Light Accent 6" w:uiPriority="46"/>
+    <w:lsdException w:name="Grid Table 2 Accent 6" w:uiPriority="47"/>
+    <w:lsdException w:name="Grid Table 3 Accent 6" w:uiPriority="48"/>
+    <w:lsdException w:name="Grid Table 4 Accent 6" w:uiPriority="49"/>
+    <w:lsdException w:name="Grid Table 5 Dark Accent 6" w:uiPriority="50"/>
+    <w:lsdException w:name="Grid Table 6 Colorful Accent 6" w:uiPriority="51"/>
+    <w:lsdException w:name="Grid Table 7 Colorful Accent 6" w:uiPriority="52"/>
+    <w:lsdException w:name="List Table 1 Light" w:uiPriority="46"/>
+    <w:lsdException w:name="List Table 2" w:uiPriority="47"/>
+    <w:lsdException w:name="List Table 3" w:uiPriority="48"/>
+    <w:lsdException w:name="List Table 4" w:uiPriority="49"/>
+    <w:lsdException w:name="List Table 5 Dark" w:uiPriority="50"/>
+    <w:lsdException w:name="List Table 6 Colorful" w:uiPriority="51"/>
+    <w:lsdException w:name="List Table 7 Colorful" w:uiPriority="52"/>
+    <w:lsdException w:name="List Table 1 Light Accent 1" w:uiPriority="46"/>
+    <w:lsdException w:name="List Table 2 Accent 1" w:uiPriority="47"/>
+    <w:lsdException w:name="List Table 3 Accent 1" w:uiPriority="48"/>
+    <w:lsdException w:name="List Table 4 Accent 1" w:uiPriority="49"/>
+    <w:lsdException w:name="List Table 5 Dark Accent 1" w:uiPriority="50"/>
+    <w:lsdException w:name="List Table 6 Colorful Accent 1" w:uiPriority="51"/>
+    <w:lsdException w:name="List Table 7 Colorful Accent 1" w:uiPriority="52"/>
+    <w:lsdException w:name="List Table 1 Light Accent 2" w:uiPriority="46"/>
+    <w:lsdException w:name="List Table 2 Accent 2" w:uiPriority="47"/>
+    <w:lsdException w:name="List Table 3 Accent 2" w:uiPriority="48"/>
+    <w:lsdException w:name="List Table 4 Accent 2" w:uiPriority="49"/>
+    <w:lsdException w:name="List Table 5 Dark Accent 2" w:uiPriority="50"/>
+    <w:lsdException w:name="List Table 6 Colorful Accent 2" w:uiPriority="51"/>
+    <w:lsdException w:name="List Table 7 Colorful Accent 2" w:uiPriority="52"/>
+    <w:lsdException w:name="List Table 1 Light Accent 3" w:uiPriority="46"/>
+    <w:lsdException w:name="List Table 2 Accent 3" w:uiPriority="47"/>
+    <w:lsdException w:name="List Table 3 Accent 3" w:uiPriority="48"/>
+    <w:lsdException w:name="List Table 4 Accent 3" w:uiPriority="49"/>
+    <w:lsdException w:name="List Table 5 Dark Accent 3" w:uiPriority="50"/>
+    <w:lsdException w:name="List Table 6 Colorful Accent 3" w:uiPriority="51"/>
+    <w:lsdException w:name="List Table 7 Colorful Accent 3" w:uiPriority="52"/>
+    <w:lsdException w:name="List Table 1 Light Accent 4" w:uiPriority="46"/>
+    <w:lsdException w:name="List Table 2 Accent 4" w:uiPriority="47"/>
+    <w:lsdException w:name="List Table 3 Accent 4" w:uiPriority="48"/>
+    <w:lsdException w:name="List Table 4 Accent 4" w:uiPriority="49"/>
+    <w:lsdException w:name="List Table 5 Dark Accent 4" w:uiPriority="50"/>
+    <w:lsdException w:name="List Table 6 Colorful Accent 4" w:uiPriority="51"/>
+    <w:lsdException w:name="List Table 7 Colorful Accent 4" w:uiPriority="52"/>
+    <w:lsdException w:name="List Table 1 Light Accent 5" w:uiPriority="46"/>
+    <w:lsdException w:name="List Table 2 Accent 5" w:uiPriority="47"/>
+    <w:lsdException w:name="List Table 3 Accent 5" w:uiPriority="48"/>
+    <w:lsdException w:name="List Table 4 Accent 5" w:uiPriority="49"/>
+    <w:lsdException w:name="List Table 5 Dark Accent 5" w:uiPriority="50"/>
+    <w:lsdException w:name="List Table 6 Colorful Accent 5" w:uiPriority="51"/>
+    <w:lsdException w:name="List Table 7 Colorful Accent 5" w:uiPriority="52"/>
+    <w:lsdException w:name="List Table 1 Light Accent 6" w:uiPriority="46"/>
+    <w:lsdException w:name="List Table 2 Accent 6" w:uiPriority="47"/>
+    <w:lsdException w:name="List Table 3 Accent 6" w:uiPriority="48"/>
+    <w:lsdException w:name="List Table 4 Accent 6" w:uiPriority="49"/>
+    <w:lsdException w:name="List Table 5 Dark Accent 6" w:uiPriority="50"/>
+    <w:lsdException w:name="List Table 6 Colorful Accent 6" w:uiPriority="51"/>
+    <w:lsdException w:name="List Table 7 Colorful Accent 6" w:uiPriority="52"/>
+    <w:lsdException w:name="Mention" w:semiHidden="1" w:unhideWhenUsed="1"/>
+    <w:lsdException w:name="Smart Hyperlink" w:semiHidden="1" w:unhideWhenUsed="1"/>
+    <w:lsdException w:name="Hashtag" w:semiHidden="1" w:unhideWhenUsed="1"/>
+    <w:lsdException w:name="Unresolved Mention" w:semiHidden="1" w:unhideWhenUsed="1"/>
+    <w:lsdException w:name="Smart Link" w:semiHidden="1" w:unhideWhenUsed="1"/>
+  </w:latentStyles>
   <w:style w:type="paragraph" w:default="1" w:styleId="Normal">
     <w:name w:val="Normal"/>
     <w:qFormat/>
@@ -3782,6 +4185,7 @@
     <w:name w:val="heading 1"/>
     <w:basedOn w:val="Normal"/>
     <w:next w:val="Normal"/>
+    <w:uiPriority w:val="9"/>
     <w:qFormat/>
     <w:pPr>
       <w:keepNext/>
@@ -3797,6 +4201,8 @@
     <w:name w:val="heading 2"/>
     <w:basedOn w:val="Normal"/>
     <w:next w:val="Normal"/>
+    <w:uiPriority w:val="9"/>
+    <w:unhideWhenUsed/>
     <w:qFormat/>
     <w:pPr>
       <w:keepNext/>
@@ -3812,6 +4218,8 @@
     <w:name w:val="heading 3"/>
     <w:basedOn w:val="Normal"/>
     <w:next w:val="Normal"/>
+    <w:uiPriority w:val="9"/>
+    <w:unhideWhenUsed/>
     <w:qFormat/>
     <w:pPr>
       <w:keepNext/>
@@ -3827,6 +4235,9 @@
     <w:name w:val="heading 4"/>
     <w:basedOn w:val="Normal"/>
     <w:next w:val="Normal"/>
+    <w:uiPriority w:val="9"/>
+    <w:semiHidden/>
+    <w:unhideWhenUsed/>
     <w:qFormat/>
     <w:pPr>
       <w:keepNext/>
@@ -3834,13 +4245,15 @@
     </w:pPr>
     <w:rPr>
       <w:b/>
-      <w:sz w:val="22"/>
     </w:rPr>
   </w:style>
   <w:style w:type="paragraph" w:styleId="Heading5">
     <w:name w:val="heading 5"/>
     <w:basedOn w:val="Normal"/>
     <w:next w:val="Normal"/>
+    <w:uiPriority w:val="9"/>
+    <w:semiHidden/>
+    <w:unhideWhenUsed/>
     <w:qFormat/>
     <w:pPr>
       <w:keepNext/>
@@ -3848,13 +4261,15 @@
     </w:pPr>
     <w:rPr>
       <w:b/>
-      <w:sz w:val="22"/>
     </w:rPr>
   </w:style>
   <w:style w:type="paragraph" w:styleId="Heading6">
     <w:name w:val="heading 6"/>
     <w:basedOn w:val="Normal"/>
     <w:next w:val="Normal"/>
+    <w:uiPriority w:val="9"/>
+    <w:semiHidden/>
+    <w:unhideWhenUsed/>
     <w:qFormat/>
     <w:pPr>
       <w:keepNext/>
@@ -3862,13 +4277,40 @@
     </w:pPr>
     <w:rPr>
       <w:i/>
-      <w:sz w:val="22"/>
     </w:rPr>
+  </w:style>
+  <w:style w:type="character" w:default="1" w:styleId="DefaultParagraphFont">
+    <w:name w:val="Default Paragraph Font"/>
+    <w:uiPriority w:val="1"/>
+    <w:semiHidden/>
+    <w:unhideWhenUsed/>
+  </w:style>
+  <w:style w:type="table" w:default="1" w:styleId="TableNormal">
+    <w:name w:val="Normal Table"/>
+    <w:uiPriority w:val="99"/>
+    <w:semiHidden/>
+    <w:unhideWhenUsed/>
+    <w:tblPr>
+      <w:tblInd w:w="0" w:type="dxa"/>
+      <w:tblCellMar>
+        <w:top w:w="0" w:type="dxa"/>
+        <w:left w:w="108" w:type="dxa"/>
+        <w:bottom w:w="0" w:type="dxa"/>
+        <w:right w:w="108" w:type="dxa"/>
+      </w:tblCellMar>
+    </w:tblPr>
+  </w:style>
+  <w:style w:type="numbering" w:default="1" w:styleId="NoList">
+    <w:name w:val="No List"/>
+    <w:uiPriority w:val="99"/>
+    <w:semiHidden/>
+    <w:unhideWhenUsed/>
   </w:style>
   <w:style w:type="paragraph" w:styleId="Title">
     <w:name w:val="Title"/>
     <w:basedOn w:val="Normal"/>
     <w:next w:val="Normal"/>
+    <w:uiPriority w:val="10"/>
     <w:qFormat/>
     <w:pPr>
       <w:spacing w:after="80"/>
@@ -3883,35 +4325,35 @@
     <w:basedOn w:val="Normal"/>
     <w:qFormat/>
     <w:pPr>
-      <w:ind w:left="720" w:right="720"/>
       <w:pBdr>
         <w:left w:val="single" w:sz="12" w:space="8" w:color="A0A0A0"/>
       </w:pBdr>
+      <w:ind w:left="720" w:right="720"/>
     </w:pPr>
     <w:rPr>
       <w:i/>
       <w:color w:val="404040"/>
     </w:rPr>
   </w:style>
-  <w:style w:type="paragraph" w:styleId="Code">
+  <w:style w:type="paragraph" w:customStyle="1" w:styleId="Code">
     <w:name w:val="Code"/>
     <w:basedOn w:val="Normal"/>
     <w:link w:val="CodeChar"/>
     <w:pPr>
+      <w:shd w:val="clear" w:color="auto" w:fill="F5F5F5"/>
       <w:spacing w:after="0" w:line="240" w:lineRule="auto"/>
       <w:contextualSpacing/>
-      <w:shd w:val="clear" w:color="auto" w:fill="F5F5F5"/>
     </w:pPr>
     <w:rPr>
-      <w:rFonts w:ascii="Consolas" w:hAnsi="Consolas" w:eastAsia="Consolas" w:cs="Consolas"/>
+      <w:rFonts w:ascii="Consolas" w:eastAsia="Consolas" w:hAnsi="Consolas" w:cs="Consolas"/>
       <w:sz w:val="20"/>
     </w:rPr>
   </w:style>
-  <w:style w:type="character" w:styleId="CodeChar">
+  <w:style w:type="character" w:customStyle="1" w:styleId="CodeChar">
     <w:name w:val="Code Char"/>
     <w:link w:val="Code"/>
     <w:rPr>
-      <w:rFonts w:ascii="Consolas" w:hAnsi="Consolas" w:eastAsia="Consolas" w:cs="Consolas"/>
+      <w:rFonts w:ascii="Consolas" w:eastAsia="Consolas" w:hAnsi="Consolas" w:cs="Consolas"/>
       <w:sz w:val="20"/>
       <w:shd w:val="clear" w:color="auto" w:fill="F5F5F5"/>
     </w:rPr>
@@ -3935,7 +4377,6 @@
   <w:style w:type="paragraph" w:styleId="CommentText">
     <w:name w:val="annotation text"/>
     <w:basedOn w:val="Normal"/>
-    <w:link w:val="CommentTextChar"/>
     <w:pPr>
       <w:spacing w:line="240" w:lineRule="auto"/>
     </w:pPr>
@@ -3951,18 +4392,6 @@
       <w:szCs w:val="16"/>
     </w:rPr>
   </w:style>
-  <w:style w:type="table" w:default="1" w:styleId="TableNormal">
-    <w:name w:val="Normal Table"/>
-    <w:tblPr>
-      <w:tblInd w:w="0" w:type="dxa"/>
-      <w:tblCellMar>
-        <w:top w:w="0" w:type="dxa"/>
-        <w:left w:w="108" w:type="dxa"/>
-        <w:bottom w:w="0" w:type="dxa"/>
-        <w:right w:w="108" w:type="dxa"/>
-      </w:tblCellMar>
-    </w:tblPr>
-  </w:style>
   <w:style w:type="table" w:styleId="TableGrid">
     <w:name w:val="Table Grid"/>
     <w:basedOn w:val="TableNormal"/>
@@ -3977,5 +4406,364 @@
       </w:tblBorders>
     </w:tblPr>
   </w:style>
+  <w:style w:type="paragraph" w:styleId="Header">
+    <w:name w:val="header"/>
+    <w:basedOn w:val="Normal"/>
+    <w:link w:val="HeaderChar"/>
+    <w:uiPriority w:val="99"/>
+    <w:unhideWhenUsed/>
+    <w:rsid w:val="00306AEA"/>
+    <w:pPr>
+      <w:tabs>
+        <w:tab w:val="center" w:pos="4680"/>
+        <w:tab w:val="right" w:pos="9360"/>
+      </w:tabs>
+      <w:spacing w:after="0" w:line="240" w:lineRule="auto"/>
+    </w:pPr>
+  </w:style>
+  <w:style w:type="character" w:customStyle="1" w:styleId="HeaderChar">
+    <w:name w:val="Header Char"/>
+    <w:basedOn w:val="DefaultParagraphFont"/>
+    <w:link w:val="Header"/>
+    <w:uiPriority w:val="99"/>
+    <w:rsid w:val="00306AEA"/>
+  </w:style>
+  <w:style w:type="paragraph" w:styleId="Footer">
+    <w:name w:val="footer"/>
+    <w:basedOn w:val="Normal"/>
+    <w:link w:val="FooterChar"/>
+    <w:uiPriority w:val="99"/>
+    <w:unhideWhenUsed/>
+    <w:rsid w:val="00306AEA"/>
+    <w:pPr>
+      <w:tabs>
+        <w:tab w:val="center" w:pos="4680"/>
+        <w:tab w:val="right" w:pos="9360"/>
+      </w:tabs>
+      <w:spacing w:after="0" w:line="240" w:lineRule="auto"/>
+    </w:pPr>
+  </w:style>
+  <w:style w:type="character" w:customStyle="1" w:styleId="FooterChar">
+    <w:name w:val="Footer Char"/>
+    <w:basedOn w:val="DefaultParagraphFont"/>
+    <w:link w:val="Footer"/>
+    <w:uiPriority w:val="99"/>
+    <w:rsid w:val="00306AEA"/>
+  </w:style>
 </w:styles>
+</file>
+
+<file path=word/theme/theme1.xml><?xml version="1.0" encoding="utf-8"?>
+<a:theme xmlns:a="http://schemas.openxmlformats.org/drawingml/2006/main" name="Office Theme">
+  <a:themeElements>
+    <a:clrScheme name="Office">
+      <a:dk1>
+        <a:sysClr val="windowText" lastClr="000000"/>
+      </a:dk1>
+      <a:lt1>
+        <a:sysClr val="window" lastClr="FFFFFF"/>
+      </a:lt1>
+      <a:dk2>
+        <a:srgbClr val="0E2841"/>
+      </a:dk2>
+      <a:lt2>
+        <a:srgbClr val="E8E8E8"/>
+      </a:lt2>
+      <a:accent1>
+        <a:srgbClr val="156082"/>
+      </a:accent1>
+      <a:accent2>
+        <a:srgbClr val="E97132"/>
+      </a:accent2>
+      <a:accent3>
+        <a:srgbClr val="196B24"/>
+      </a:accent3>
+      <a:accent4>
+        <a:srgbClr val="0F9ED5"/>
+      </a:accent4>
+      <a:accent5>
+        <a:srgbClr val="A02B93"/>
+      </a:accent5>
+      <a:accent6>
+        <a:srgbClr val="4EA72E"/>
+      </a:accent6>
+      <a:hlink>
+        <a:srgbClr val="467886"/>
+      </a:hlink>
+      <a:folHlink>
+        <a:srgbClr val="96607D"/>
+      </a:folHlink>
+    </a:clrScheme>
+    <a:fontScheme name="Office">
+      <a:majorFont>
+        <a:latin typeface="Aptos Display" panose="02110004020202020204"/>
+        <a:ea typeface=""/>
+        <a:cs typeface=""/>
+        <a:font script="Jpan" typeface="游ゴシック Light"/>
+        <a:font script="Hang" typeface="맑은 고딕"/>
+        <a:font script="Hans" typeface="等线 Light"/>
+        <a:font script="Hant" typeface="新細明體"/>
+        <a:font script="Arab" typeface="Times New Roman"/>
+        <a:font script="Hebr" typeface="Times New Roman"/>
+        <a:font script="Thai" typeface="Angsana New"/>
+        <a:font script="Ethi" typeface="Nyala"/>
+        <a:font script="Beng" typeface="Vrinda"/>
+        <a:font script="Gujr" typeface="Shruti"/>
+        <a:font script="Khmr" typeface="MoolBoran"/>
+        <a:font script="Knda" typeface="Tunga"/>
+        <a:font script="Guru" typeface="Raavi"/>
+        <a:font script="Cans" typeface="Euphemia"/>
+        <a:font script="Cher" typeface="Plantagenet Cherokee"/>
+        <a:font script="Yiii" typeface="Microsoft Yi Baiti"/>
+        <a:font script="Tibt" typeface="Microsoft Himalaya"/>
+        <a:font script="Thaa" typeface="MV Boli"/>
+        <a:font script="Deva" typeface="Mangal"/>
+        <a:font script="Telu" typeface="Gautami"/>
+        <a:font script="Taml" typeface="Latha"/>
+        <a:font script="Syrc" typeface="Estrangelo Edessa"/>
+        <a:font script="Orya" typeface="Kalinga"/>
+        <a:font script="Mlym" typeface="Kartika"/>
+        <a:font script="Laoo" typeface="DokChampa"/>
+        <a:font script="Sinh" typeface="Iskoola Pota"/>
+        <a:font script="Mong" typeface="Mongolian Baiti"/>
+        <a:font script="Viet" typeface="Times New Roman"/>
+        <a:font script="Uigh" typeface="Microsoft Uighur"/>
+        <a:font script="Geor" typeface="Sylfaen"/>
+        <a:font script="Armn" typeface="Arial"/>
+        <a:font script="Bugi" typeface="Leelawadee UI"/>
+        <a:font script="Bopo" typeface="Microsoft JhengHei"/>
+        <a:font script="Java" typeface="Javanese Text"/>
+        <a:font script="Lisu" typeface="Segoe UI"/>
+        <a:font script="Mymr" typeface="Myanmar Text"/>
+        <a:font script="Nkoo" typeface="Ebrima"/>
+        <a:font script="Olck" typeface="Nirmala UI"/>
+        <a:font script="Osma" typeface="Ebrima"/>
+        <a:font script="Phag" typeface="Phagspa"/>
+        <a:font script="Syrn" typeface="Estrangelo Edessa"/>
+        <a:font script="Syrj" typeface="Estrangelo Edessa"/>
+        <a:font script="Syre" typeface="Estrangelo Edessa"/>
+        <a:font script="Sora" typeface="Nirmala UI"/>
+        <a:font script="Tale" typeface="Microsoft Tai Le"/>
+        <a:font script="Talu" typeface="Microsoft New Tai Lue"/>
+        <a:font script="Tfng" typeface="Ebrima"/>
+      </a:majorFont>
+      <a:minorFont>
+        <a:latin typeface="Aptos" panose="02110004020202020204"/>
+        <a:ea typeface=""/>
+        <a:cs typeface=""/>
+        <a:font script="Jpan" typeface="游明朝"/>
+        <a:font script="Hang" typeface="맑은 고딕"/>
+        <a:font script="Hans" typeface="等线"/>
+        <a:font script="Hant" typeface="新細明體"/>
+        <a:font script="Arab" typeface="Arial"/>
+        <a:font script="Hebr" typeface="Arial"/>
+        <a:font script="Thai" typeface="Cordia New"/>
+        <a:font script="Ethi" typeface="Nyala"/>
+        <a:font script="Beng" typeface="Vrinda"/>
+        <a:font script="Gujr" typeface="Shruti"/>
+        <a:font script="Khmr" typeface="DaunPenh"/>
+        <a:font script="Knda" typeface="Tunga"/>
+        <a:font script="Guru" typeface="Raavi"/>
+        <a:font script="Cans" typeface="Euphemia"/>
+        <a:font script="Cher" typeface="Plantagenet Cherokee"/>
+        <a:font script="Yiii" typeface="Microsoft Yi Baiti"/>
+        <a:font script="Tibt" typeface="Microsoft Himalaya"/>
+        <a:font script="Thaa" typeface="MV Boli"/>
+        <a:font script="Deva" typeface="Mangal"/>
+        <a:font script="Telu" typeface="Gautami"/>
+        <a:font script="Taml" typeface="Latha"/>
+        <a:font script="Syrc" typeface="Estrangelo Edessa"/>
+        <a:font script="Orya" typeface="Kalinga"/>
+        <a:font script="Mlym" typeface="Kartika"/>
+        <a:font script="Laoo" typeface="DokChampa"/>
+        <a:font script="Sinh" typeface="Iskoola Pota"/>
+        <a:font script="Mong" typeface="Mongolian Baiti"/>
+        <a:font script="Viet" typeface="Arial"/>
+        <a:font script="Uigh" typeface="Microsoft Uighur"/>
+        <a:font script="Geor" typeface="Sylfaen"/>
+        <a:font script="Armn" typeface="Arial"/>
+        <a:font script="Bugi" typeface="Leelawadee UI"/>
+        <a:font script="Bopo" typeface="Microsoft JhengHei"/>
+        <a:font script="Java" typeface="Javanese Text"/>
+        <a:font script="Lisu" typeface="Segoe UI"/>
+        <a:font script="Mymr" typeface="Myanmar Text"/>
+        <a:font script="Nkoo" typeface="Ebrima"/>
+        <a:font script="Olck" typeface="Nirmala UI"/>
+        <a:font script="Osma" typeface="Ebrima"/>
+        <a:font script="Phag" typeface="Phagspa"/>
+        <a:font script="Syrn" typeface="Estrangelo Edessa"/>
+        <a:font script="Syrj" typeface="Estrangelo Edessa"/>
+        <a:font script="Syre" typeface="Estrangelo Edessa"/>
+        <a:font script="Sora" typeface="Nirmala UI"/>
+        <a:font script="Tale" typeface="Microsoft Tai Le"/>
+        <a:font script="Talu" typeface="Microsoft New Tai Lue"/>
+        <a:font script="Tfng" typeface="Ebrima"/>
+      </a:minorFont>
+    </a:fontScheme>
+    <a:fmtScheme name="Office">
+      <a:fillStyleLst>
+        <a:solidFill>
+          <a:schemeClr val="phClr"/>
+        </a:solidFill>
+        <a:gradFill rotWithShape="1">
+          <a:gsLst>
+            <a:gs pos="0">
+              <a:schemeClr val="phClr">
+                <a:lumMod val="110000"/>
+                <a:satMod val="105000"/>
+                <a:tint val="67000"/>
+              </a:schemeClr>
+            </a:gs>
+            <a:gs pos="50000">
+              <a:schemeClr val="phClr">
+                <a:lumMod val="105000"/>
+                <a:satMod val="103000"/>
+                <a:tint val="73000"/>
+              </a:schemeClr>
+            </a:gs>
+            <a:gs pos="100000">
+              <a:schemeClr val="phClr">
+                <a:lumMod val="105000"/>
+                <a:satMod val="109000"/>
+                <a:tint val="81000"/>
+              </a:schemeClr>
+            </a:gs>
+          </a:gsLst>
+          <a:lin ang="5400000" scaled="0"/>
+        </a:gradFill>
+        <a:gradFill rotWithShape="1">
+          <a:gsLst>
+            <a:gs pos="0">
+              <a:schemeClr val="phClr">
+                <a:satMod val="103000"/>
+                <a:lumMod val="102000"/>
+                <a:tint val="94000"/>
+              </a:schemeClr>
+            </a:gs>
+            <a:gs pos="50000">
+              <a:schemeClr val="phClr">
+                <a:satMod val="110000"/>
+                <a:lumMod val="100000"/>
+                <a:shade val="100000"/>
+              </a:schemeClr>
+            </a:gs>
+            <a:gs pos="100000">
+              <a:schemeClr val="phClr">
+                <a:lumMod val="99000"/>
+                <a:satMod val="120000"/>
+                <a:shade val="78000"/>
+              </a:schemeClr>
+            </a:gs>
+          </a:gsLst>
+          <a:lin ang="5400000" scaled="0"/>
+        </a:gradFill>
+      </a:fillStyleLst>
+      <a:lnStyleLst>
+        <a:ln w="12700" cap="flat" cmpd="sng" algn="ctr">
+          <a:solidFill>
+            <a:schemeClr val="phClr"/>
+          </a:solidFill>
+          <a:prstDash val="solid"/>
+          <a:miter lim="800000"/>
+        </a:ln>
+        <a:ln w="19050" cap="flat" cmpd="sng" algn="ctr">
+          <a:solidFill>
+            <a:schemeClr val="phClr"/>
+          </a:solidFill>
+          <a:prstDash val="solid"/>
+          <a:miter lim="800000"/>
+        </a:ln>
+        <a:ln w="25400" cap="flat" cmpd="sng" algn="ctr">
+          <a:solidFill>
+            <a:schemeClr val="phClr"/>
+          </a:solidFill>
+          <a:prstDash val="solid"/>
+          <a:miter lim="800000"/>
+        </a:ln>
+      </a:lnStyleLst>
+      <a:effectStyleLst>
+        <a:effectStyle>
+          <a:effectLst/>
+        </a:effectStyle>
+        <a:effectStyle>
+          <a:effectLst/>
+        </a:effectStyle>
+        <a:effectStyle>
+          <a:effectLst>
+            <a:outerShdw blurRad="57150" dist="19050" dir="5400000" algn="ctr" rotWithShape="0">
+              <a:srgbClr val="000000">
+                <a:alpha val="63000"/>
+              </a:srgbClr>
+            </a:outerShdw>
+          </a:effectLst>
+        </a:effectStyle>
+      </a:effectStyleLst>
+      <a:bgFillStyleLst>
+        <a:solidFill>
+          <a:schemeClr val="phClr"/>
+        </a:solidFill>
+        <a:solidFill>
+          <a:schemeClr val="phClr">
+            <a:tint val="95000"/>
+            <a:satMod val="170000"/>
+          </a:schemeClr>
+        </a:solidFill>
+        <a:gradFill rotWithShape="1">
+          <a:gsLst>
+            <a:gs pos="0">
+              <a:schemeClr val="phClr">
+                <a:tint val="93000"/>
+                <a:satMod val="150000"/>
+                <a:shade val="98000"/>
+                <a:lumMod val="102000"/>
+              </a:schemeClr>
+            </a:gs>
+            <a:gs pos="50000">
+              <a:schemeClr val="phClr">
+                <a:tint val="98000"/>
+                <a:satMod val="130000"/>
+                <a:shade val="90000"/>
+                <a:lumMod val="103000"/>
+              </a:schemeClr>
+            </a:gs>
+            <a:gs pos="100000">
+              <a:schemeClr val="phClr">
+                <a:shade val="63000"/>
+                <a:satMod val="120000"/>
+              </a:schemeClr>
+            </a:gs>
+          </a:gsLst>
+          <a:lin ang="5400000" scaled="0"/>
+        </a:gradFill>
+      </a:bgFillStyleLst>
+    </a:fmtScheme>
+  </a:themeElements>
+  <a:objectDefaults>
+    <a:lnDef>
+      <a:spPr/>
+      <a:bodyPr/>
+      <a:lstStyle/>
+      <a:style>
+        <a:lnRef idx="2">
+          <a:schemeClr val="accent1"/>
+        </a:lnRef>
+        <a:fillRef idx="0">
+          <a:schemeClr val="accent1"/>
+        </a:fillRef>
+        <a:effectRef idx="1">
+          <a:schemeClr val="accent1"/>
+        </a:effectRef>
+        <a:fontRef idx="minor">
+          <a:schemeClr val="tx1"/>
+        </a:fontRef>
+      </a:style>
+    </a:lnDef>
+  </a:objectDefaults>
+  <a:extraClrSchemeLst/>
+  <a:extLst>
+    <a:ext uri="{05A4C25C-085E-4340-85A3-A5531E510DB2}">
+      <thm15:themeFamily xmlns:thm15="http://schemas.microsoft.com/office/thememl/2012/main" name="Office Theme" id="{2E142A2C-CD16-42D6-873A-C26D2A0506FA}" vid="{1BDDFF52-6CD6-40A5-AB3C-68EB2F1E4D0A}"/>
+    </a:ext>
+  </a:extLst>
+</a:theme>
 </file>
</xml_diff>